<commit_message>
Added images/videos to almost all projects and also aesthetic changes
</commit_message>
<xml_diff>
--- a/public/Resume_Bianca_Frantzeskakis.docx
+++ b/public/Resume_Bianca_Frantzeskakis.docx
@@ -8,32 +8,33 @@
           <w:bottom w:val="single" w:sz="12" w:space="1" w:color="000000"/>
         </w:pBdr>
         <w:spacing w:after="0"/>
-        <w:jc w:val="center"/>
-        <w:rPr>
-          <w:rFonts w:ascii="HoloLens MDL2 Assets" w:eastAsia="Times New Roman" w:hAnsi="HoloLens MDL2 Assets" w:cs="Times New Roman"/>
-          <w:sz w:val="18"/>
-          <w:szCs w:val="18"/>
+        <w:ind w:firstLine="720"/>
+        <w:jc w:val="right"/>
+        <w:rPr>
+          <w:rFonts w:ascii="HoloLens MDL2 Assets" w:eastAsia="Times New Roman" w:hAnsi="HoloLens MDL2 Assets" w:cs="Times New Roman"/>
         </w:rPr>
       </w:pPr>
       <w:r>
         <w:rPr>
           <w:rFonts w:ascii="HoloLens MDL2 Assets" w:hAnsi="HoloLens MDL2 Assets"/>
           <w:noProof/>
+          <w:sz w:val="26"/>
+          <w:szCs w:val="28"/>
         </w:rPr>
         <mc:AlternateContent>
           <mc:Choice Requires="wps">
             <w:drawing>
-              <wp:anchor distT="0" distB="0" distL="114300" distR="114300" simplePos="0" relativeHeight="251659264" behindDoc="0" locked="0" layoutInCell="1" allowOverlap="1" wp14:anchorId="5112C2F2" wp14:editId="15F273C6">
+              <wp:anchor distT="0" distB="0" distL="114300" distR="114300" simplePos="0" relativeHeight="251659264" behindDoc="0" locked="0" layoutInCell="1" allowOverlap="1" wp14:anchorId="7D12BECC" wp14:editId="532E959D">
                 <wp:simplePos x="0" y="0"/>
                 <wp:positionH relativeFrom="margin">
-                  <wp:posOffset>-225791</wp:posOffset>
+                  <wp:posOffset>-152400</wp:posOffset>
                 </wp:positionH>
                 <wp:positionV relativeFrom="paragraph">
-                  <wp:posOffset>17</wp:posOffset>
+                  <wp:posOffset>-123825</wp:posOffset>
                 </wp:positionV>
-                <wp:extent cx="3302000" cy="425450"/>
+                <wp:extent cx="2562225" cy="425450"/>
                 <wp:effectExtent l="0" t="0" r="0" b="0"/>
-                <wp:wrapSquare wrapText="bothSides"/>
+                <wp:wrapNone/>
                 <wp:docPr id="1" name="Text Box 1"/>
                 <wp:cNvGraphicFramePr/>
                 <a:graphic xmlns:a="http://schemas.openxmlformats.org/drawingml/2006/main">
@@ -43,7 +44,7 @@
                       <wps:spPr>
                         <a:xfrm>
                           <a:off x="0" y="0"/>
-                          <a:ext cx="3302000" cy="425450"/>
+                          <a:ext cx="2562225" cy="425450"/>
                         </a:xfrm>
                         <a:prstGeom prst="rect">
                           <a:avLst/>
@@ -60,8 +61,8 @@
                               <w:spacing w:line="240" w:lineRule="auto"/>
                               <w:rPr>
                                 <w:rFonts w:ascii="HoloLens MDL2 Assets" w:eastAsia="Times New Roman" w:hAnsi="HoloLens MDL2 Assets" w:cs="Times New Roman"/>
-                                <w:sz w:val="48"/>
-                                <w:szCs w:val="48"/>
+                                <w:sz w:val="40"/>
+                                <w:szCs w:val="40"/>
                                 <w14:shadow w14:blurRad="38100" w14:dist="19050" w14:dir="2700000" w14:sx="100000" w14:sy="100000" w14:kx="0" w14:ky="0" w14:algn="tl">
                                   <w14:schemeClr w14:val="dk1">
                                     <w14:alpha w14:val="60000"/>
@@ -79,8 +80,8 @@
                             <w:r>
                               <w:rPr>
                                 <w:rFonts w:ascii="HoloLens MDL2 Assets" w:eastAsia="Times New Roman" w:hAnsi="HoloLens MDL2 Assets" w:cs="Times New Roman"/>
-                                <w:sz w:val="48"/>
-                                <w:szCs w:val="48"/>
+                                <w:sz w:val="40"/>
+                                <w:szCs w:val="40"/>
                                 <w14:shadow w14:blurRad="38100" w14:dist="19050" w14:dir="2700000" w14:sx="100000" w14:sy="100000" w14:kx="0" w14:ky="0" w14:algn="tl">
                                   <w14:schemeClr w14:val="dk1">
                                     <w14:alpha w14:val="60000"/>
@@ -94,47 +95,7 @@
                                   <w14:round/>
                                 </w14:textOutline>
                               </w:rPr>
-                              <w:t>Bianca</w:t>
-                            </w:r>
-                            <w:r>
-                              <w:rPr>
-                                <w:rFonts w:ascii="HoloLens MDL2 Assets" w:eastAsia="Times New Roman" w:hAnsi="HoloLens MDL2 Assets" w:cs="Times New Roman"/>
-                                <w:sz w:val="48"/>
-                                <w:szCs w:val="48"/>
-                                <w14:shadow w14:blurRad="38100" w14:dist="19050" w14:dir="2700000" w14:sx="100000" w14:sy="100000" w14:kx="0" w14:ky="0" w14:algn="tl">
-                                  <w14:schemeClr w14:val="dk1">
-                                    <w14:alpha w14:val="60000"/>
-                                  </w14:schemeClr>
-                                </w14:shadow>
-                                <w14:textOutline w14:w="9525" w14:cap="flat" w14:cmpd="sng" w14:algn="ctr">
-                                  <w14:solidFill>
-                                    <w14:srgbClr w14:val="000000"/>
-                                  </w14:solidFill>
-                                  <w14:prstDash w14:val="solid"/>
-                                  <w14:round/>
-                                </w14:textOutline>
-                              </w:rPr>
-                              <w:t xml:space="preserve"> </w:t>
-                            </w:r>
-                            <w:r>
-                              <w:rPr>
-                                <w:rFonts w:ascii="HoloLens MDL2 Assets" w:eastAsia="Times New Roman" w:hAnsi="HoloLens MDL2 Assets" w:cs="Times New Roman"/>
-                                <w:sz w:val="48"/>
-                                <w:szCs w:val="48"/>
-                                <w14:shadow w14:blurRad="38100" w14:dist="19050" w14:dir="2700000" w14:sx="100000" w14:sy="100000" w14:kx="0" w14:ky="0" w14:algn="tl">
-                                  <w14:schemeClr w14:val="dk1">
-                                    <w14:alpha w14:val="60000"/>
-                                  </w14:schemeClr>
-                                </w14:shadow>
-                                <w14:textOutline w14:w="9525" w14:cap="flat" w14:cmpd="sng" w14:algn="ctr">
-                                  <w14:solidFill>
-                                    <w14:srgbClr w14:val="000000"/>
-                                  </w14:solidFill>
-                                  <w14:prstDash w14:val="solid"/>
-                                  <w14:round/>
-                                </w14:textOutline>
-                              </w:rPr>
-                              <w:t>Frantzeskakis</w:t>
+                              <w:t>Bianca Frantzeskakis</w:t>
                             </w:r>
                           </w:p>
                         </w:txbxContent>
@@ -159,11 +120,11 @@
           </mc:Choice>
           <mc:Fallback>
             <w:pict>
-              <v:shapetype w14:anchorId="5112C2F2" id="_x0000_t202" coordsize="21600,21600" o:spt="202" path="m,l,21600r21600,l21600,xe">
+              <v:shapetype w14:anchorId="7D12BECC" id="_x0000_t202" coordsize="21600,21600" o:spt="202" path="m,l,21600r21600,l21600,xe">
                 <v:stroke joinstyle="miter"/>
                 <v:path gradientshapeok="t" o:connecttype="rect"/>
               </v:shapetype>
-              <v:shape id="Text Box 1" o:spid="_x0000_s1026" type="#_x0000_t202" style="position:absolute;left:0;text-align:left;margin-left:-17.8pt;margin-top:0;width:260pt;height:33.5pt;z-index:251659264;visibility:visible;mso-wrap-style:square;mso-width-percent:0;mso-height-percent:0;mso-wrap-distance-left:9pt;mso-wrap-distance-top:0;mso-wrap-distance-right:9pt;mso-wrap-distance-bottom:0;mso-position-horizontal:absolute;mso-position-horizontal-relative:margin;mso-position-vertical:absolute;mso-position-vertical-relative:text;mso-width-percent:0;mso-height-percent:0;mso-width-relative:margin;mso-height-relative:margin;v-text-anchor:top" o:gfxdata="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" filled="f" stroked="f">
+              <v:shape id="Text Box 1" o:spid="_x0000_s1026" type="#_x0000_t202" style="position:absolute;left:0;text-align:left;margin-left:-12pt;margin-top:-9.75pt;width:201.75pt;height:33.5pt;z-index:251659264;visibility:visible;mso-wrap-style:square;mso-width-percent:0;mso-height-percent:0;mso-wrap-distance-left:9pt;mso-wrap-distance-top:0;mso-wrap-distance-right:9pt;mso-wrap-distance-bottom:0;mso-position-horizontal:absolute;mso-position-horizontal-relative:margin;mso-position-vertical:absolute;mso-position-vertical-relative:text;mso-width-percent:0;mso-height-percent:0;mso-width-relative:margin;mso-height-relative:margin;v-text-anchor:top" o:gfxdata="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" filled="f" stroked="f">
                 <v:textbox>
                   <w:txbxContent>
                     <w:p>
@@ -171,8 +132,8 @@
                         <w:spacing w:line="240" w:lineRule="auto"/>
                         <w:rPr>
                           <w:rFonts w:ascii="HoloLens MDL2 Assets" w:eastAsia="Times New Roman" w:hAnsi="HoloLens MDL2 Assets" w:cs="Times New Roman"/>
-                          <w:sz w:val="48"/>
-                          <w:szCs w:val="48"/>
+                          <w:sz w:val="40"/>
+                          <w:szCs w:val="40"/>
                           <w14:shadow w14:blurRad="38100" w14:dist="19050" w14:dir="2700000" w14:sx="100000" w14:sy="100000" w14:kx="0" w14:ky="0" w14:algn="tl">
                             <w14:schemeClr w14:val="dk1">
                               <w14:alpha w14:val="60000"/>
@@ -190,8 +151,8 @@
                       <w:r>
                         <w:rPr>
                           <w:rFonts w:ascii="HoloLens MDL2 Assets" w:eastAsia="Times New Roman" w:hAnsi="HoloLens MDL2 Assets" w:cs="Times New Roman"/>
-                          <w:sz w:val="48"/>
-                          <w:szCs w:val="48"/>
+                          <w:sz w:val="40"/>
+                          <w:szCs w:val="40"/>
                           <w14:shadow w14:blurRad="38100" w14:dist="19050" w14:dir="2700000" w14:sx="100000" w14:sy="100000" w14:kx="0" w14:ky="0" w14:algn="tl">
                             <w14:schemeClr w14:val="dk1">
                               <w14:alpha w14:val="60000"/>
@@ -205,52 +166,12 @@
                             <w14:round/>
                           </w14:textOutline>
                         </w:rPr>
-                        <w:t>Bianca</w:t>
-                      </w:r>
-                      <w:r>
-                        <w:rPr>
-                          <w:rFonts w:ascii="HoloLens MDL2 Assets" w:eastAsia="Times New Roman" w:hAnsi="HoloLens MDL2 Assets" w:cs="Times New Roman"/>
-                          <w:sz w:val="48"/>
-                          <w:szCs w:val="48"/>
-                          <w14:shadow w14:blurRad="38100" w14:dist="19050" w14:dir="2700000" w14:sx="100000" w14:sy="100000" w14:kx="0" w14:ky="0" w14:algn="tl">
-                            <w14:schemeClr w14:val="dk1">
-                              <w14:alpha w14:val="60000"/>
-                            </w14:schemeClr>
-                          </w14:shadow>
-                          <w14:textOutline w14:w="9525" w14:cap="flat" w14:cmpd="sng" w14:algn="ctr">
-                            <w14:solidFill>
-                              <w14:srgbClr w14:val="000000"/>
-                            </w14:solidFill>
-                            <w14:prstDash w14:val="solid"/>
-                            <w14:round/>
-                          </w14:textOutline>
-                        </w:rPr>
-                        <w:t xml:space="preserve"> </w:t>
-                      </w:r>
-                      <w:r>
-                        <w:rPr>
-                          <w:rFonts w:ascii="HoloLens MDL2 Assets" w:eastAsia="Times New Roman" w:hAnsi="HoloLens MDL2 Assets" w:cs="Times New Roman"/>
-                          <w:sz w:val="48"/>
-                          <w:szCs w:val="48"/>
-                          <w14:shadow w14:blurRad="38100" w14:dist="19050" w14:dir="2700000" w14:sx="100000" w14:sy="100000" w14:kx="0" w14:ky="0" w14:algn="tl">
-                            <w14:schemeClr w14:val="dk1">
-                              <w14:alpha w14:val="60000"/>
-                            </w14:schemeClr>
-                          </w14:shadow>
-                          <w14:textOutline w14:w="9525" w14:cap="flat" w14:cmpd="sng" w14:algn="ctr">
-                            <w14:solidFill>
-                              <w14:srgbClr w14:val="000000"/>
-                            </w14:solidFill>
-                            <w14:prstDash w14:val="solid"/>
-                            <w14:round/>
-                          </w14:textOutline>
-                        </w:rPr>
-                        <w:t>Frantzeskakis</w:t>
+                        <w:t>Bianca Frantzeskakis</w:t>
                       </w:r>
                     </w:p>
                   </w:txbxContent>
                 </v:textbox>
-                <w10:wrap type="square" anchorx="margin"/>
+                <w10:wrap anchorx="margin"/>
               </v:shape>
             </w:pict>
           </mc:Fallback>
@@ -259,115 +180,8 @@
       <w:r>
         <w:rPr>
           <w:rFonts w:ascii="HoloLens MDL2 Assets" w:eastAsia="Times New Roman" w:hAnsi="HoloLens MDL2 Assets" w:cs="Times New Roman"/>
-          <w:sz w:val="18"/>
-          <w:szCs w:val="18"/>
-        </w:rPr>
-        <w:t>biancafrantz01</w:t>
-      </w:r>
-      <w:r>
-        <w:rPr>
-          <w:rFonts w:ascii="HoloLens MDL2 Assets" w:eastAsia="Times New Roman" w:hAnsi="HoloLens MDL2 Assets" w:cs="Times New Roman"/>
-          <w:sz w:val="18"/>
-          <w:szCs w:val="18"/>
-        </w:rPr>
-        <w:t>@</w:t>
-      </w:r>
-      <w:r>
-        <w:rPr>
-          <w:rFonts w:ascii="HoloLens MDL2 Assets" w:eastAsia="Times New Roman" w:hAnsi="HoloLens MDL2 Assets" w:cs="Times New Roman"/>
-          <w:sz w:val="18"/>
-          <w:szCs w:val="18"/>
-        </w:rPr>
-        <w:t>gmail</w:t>
-      </w:r>
-      <w:r>
-        <w:rPr>
-          <w:rFonts w:ascii="HoloLens MDL2 Assets" w:eastAsia="Times New Roman" w:hAnsi="HoloLens MDL2 Assets" w:cs="Times New Roman"/>
-          <w:sz w:val="18"/>
-          <w:szCs w:val="18"/>
-        </w:rPr>
-        <w:t>.</w:t>
-      </w:r>
-      <w:r>
-        <w:rPr>
-          <w:rFonts w:ascii="HoloLens MDL2 Assets" w:eastAsia="Times New Roman" w:hAnsi="HoloLens MDL2 Assets" w:cs="Times New Roman"/>
-          <w:sz w:val="18"/>
-          <w:szCs w:val="18"/>
-        </w:rPr>
-        <w:t>com</w:t>
-      </w:r>
-      <w:r>
-        <w:rPr>
-          <w:rFonts w:ascii="HoloLens MDL2 Assets" w:eastAsia="Times New Roman" w:hAnsi="HoloLens MDL2 Assets" w:cs="Times New Roman"/>
-          <w:sz w:val="18"/>
-          <w:szCs w:val="18"/>
-        </w:rPr>
-        <w:t xml:space="preserve"> | 954-319-2455 | </w:t>
-      </w:r>
-      <w:r>
-        <w:rPr>
-          <w:rFonts w:ascii="HoloLens MDL2 Assets" w:eastAsia="Times New Roman" w:hAnsi="HoloLens MDL2 Assets" w:cs="Times New Roman"/>
-          <w:sz w:val="18"/>
-          <w:szCs w:val="18"/>
-        </w:rPr>
-        <w:br/>
-        <w:t>1</w:t>
-      </w:r>
-      <w:r>
-        <w:rPr>
-          <w:rFonts w:ascii="HoloLens MDL2 Assets" w:eastAsia="Times New Roman" w:hAnsi="HoloLens MDL2 Assets" w:cs="Times New Roman"/>
-          <w:sz w:val="18"/>
-          <w:szCs w:val="18"/>
-        </w:rPr>
-        <w:t>961 Hemingway Cir</w:t>
-      </w:r>
-      <w:r>
-        <w:rPr>
-          <w:rFonts w:ascii="HoloLens MDL2 Assets" w:eastAsia="Times New Roman" w:hAnsi="HoloLens MDL2 Assets" w:cs="Times New Roman"/>
-          <w:sz w:val="18"/>
-          <w:szCs w:val="18"/>
-        </w:rPr>
-        <w:t xml:space="preserve">, </w:t>
-      </w:r>
-      <w:r>
-        <w:rPr>
-          <w:rFonts w:ascii="HoloLens MDL2 Assets" w:eastAsia="Times New Roman" w:hAnsi="HoloLens MDL2 Assets" w:cs="Times New Roman"/>
-          <w:sz w:val="18"/>
-          <w:szCs w:val="18"/>
-        </w:rPr>
-        <w:t>Groveland</w:t>
-      </w:r>
-      <w:r>
-        <w:rPr>
-          <w:rFonts w:ascii="HoloLens MDL2 Assets" w:eastAsia="Times New Roman" w:hAnsi="HoloLens MDL2 Assets" w:cs="Times New Roman"/>
-          <w:sz w:val="18"/>
-          <w:szCs w:val="18"/>
-        </w:rPr>
-        <w:t>, FL, 3</w:t>
-      </w:r>
-      <w:r>
-        <w:rPr>
-          <w:rFonts w:ascii="HoloLens MDL2 Assets" w:eastAsia="Times New Roman" w:hAnsi="HoloLens MDL2 Assets" w:cs="Times New Roman"/>
-          <w:sz w:val="18"/>
-          <w:szCs w:val="18"/>
-        </w:rPr>
-        <w:t>4736</w:t>
-      </w:r>
-      <w:r>
-        <w:rPr>
-          <w:rFonts w:ascii="HoloLens MDL2 Assets" w:eastAsia="Times New Roman" w:hAnsi="HoloLens MDL2 Assets" w:cs="Times New Roman"/>
-          <w:sz w:val="18"/>
-          <w:szCs w:val="18"/>
-        </w:rPr>
-        <w:t xml:space="preserve"> </w:t>
-      </w:r>
-      <w:r>
-        <w:rPr>
-          <w:rFonts w:ascii="HoloLens MDL2 Assets" w:eastAsia="Times New Roman" w:hAnsi="HoloLens MDL2 Assets" w:cs="Times New Roman"/>
-          <w:sz w:val="18"/>
-          <w:szCs w:val="18"/>
-        </w:rPr>
-        <w:t>|</w:t>
+        </w:rPr>
+        <w:t xml:space="preserve">biancafrantz01@gmail.com | 954-319-2455 | </w:t>
       </w:r>
     </w:p>
     <w:p>
@@ -376,69 +190,119 @@
           <w:bottom w:val="single" w:sz="12" w:space="1" w:color="000000"/>
         </w:pBdr>
         <w:spacing w:after="0"/>
+        <w:ind w:firstLine="720"/>
         <w:jc w:val="center"/>
         <w:rPr>
           <w:rFonts w:ascii="HoloLens MDL2 Assets" w:eastAsia="Times New Roman" w:hAnsi="HoloLens MDL2 Assets" w:cs="Times New Roman"/>
-          <w:sz w:val="18"/>
-          <w:szCs w:val="18"/>
-        </w:rPr>
-      </w:pPr>
-      <w:r>
-        <w:rPr>
-          <w:rFonts w:ascii="HoloLens MDL2 Assets" w:eastAsia="Times New Roman" w:hAnsi="HoloLens MDL2 Assets" w:cs="Times New Roman"/>
-          <w:sz w:val="18"/>
-          <w:szCs w:val="18"/>
-        </w:rPr>
-        <w:t>biancafrantzeskakis.xyz</w:t>
-      </w:r>
-      <w:r>
-        <w:rPr>
-          <w:rFonts w:ascii="HoloLens MDL2 Assets" w:eastAsia="Times New Roman" w:hAnsi="HoloLens MDL2 Assets" w:cs="Times New Roman"/>
-          <w:sz w:val="18"/>
-          <w:szCs w:val="18"/>
-        </w:rPr>
-        <w:t xml:space="preserve"> </w:t>
-      </w:r>
-      <w:r>
-        <w:rPr>
-          <w:rFonts w:ascii="HoloLens MDL2 Assets" w:eastAsia="Times New Roman" w:hAnsi="HoloLens MDL2 Assets" w:cs="Times New Roman"/>
-          <w:sz w:val="18"/>
-          <w:szCs w:val="18"/>
-        </w:rPr>
-        <w:t xml:space="preserve">| </w:t>
-      </w:r>
-      <w:r>
-        <w:rPr>
-          <w:rFonts w:ascii="HoloLens MDL2 Assets" w:eastAsia="Times New Roman" w:hAnsi="HoloLens MDL2 Assets" w:cs="Times New Roman"/>
-          <w:sz w:val="18"/>
-          <w:szCs w:val="18"/>
-        </w:rPr>
-        <w:t>github.com/</w:t>
-      </w:r>
-      <w:r>
-        <w:rPr>
-          <w:rFonts w:ascii="HoloLens MDL2 Assets" w:eastAsia="Times New Roman" w:hAnsi="HoloLens MDL2 Assets" w:cs="Times New Roman"/>
-          <w:sz w:val="18"/>
-          <w:szCs w:val="18"/>
+          <w:sz w:val="20"/>
+          <w:szCs w:val="20"/>
+        </w:rPr>
+      </w:pPr>
+      <w:r>
+        <w:rPr>
+          <w:rFonts w:ascii="HoloLens MDL2 Assets" w:eastAsia="Times New Roman" w:hAnsi="HoloLens MDL2 Assets" w:cs="Times New Roman"/>
+          <w:sz w:val="20"/>
+          <w:szCs w:val="20"/>
+        </w:rPr>
+        <w:t xml:space="preserve">                                                                                                       </w:t>
+      </w:r>
+      <w:r>
+        <w:rPr>
+          <w:rFonts w:ascii="HoloLens MDL2 Assets" w:eastAsia="Times New Roman" w:hAnsi="HoloLens MDL2 Assets" w:cs="Times New Roman"/>
+        </w:rPr>
+        <w:t>Groveland, FL | github.com/</w:t>
+      </w:r>
+      <w:proofErr w:type="spellStart"/>
+      <w:r>
+        <w:rPr>
+          <w:rFonts w:ascii="HoloLens MDL2 Assets" w:eastAsia="Times New Roman" w:hAnsi="HoloLens MDL2 Assets" w:cs="Times New Roman"/>
         </w:rPr>
         <w:t>biancafrantz</w:t>
       </w:r>
+      <w:proofErr w:type="spellEnd"/>
     </w:p>
     <w:p>
       <w:pPr>
         <w:pBdr>
           <w:bottom w:val="single" w:sz="12" w:space="1" w:color="000000"/>
         </w:pBdr>
-        <w:rPr>
-          <w:rFonts w:ascii="HoloLens MDL2 Assets" w:eastAsia="Times New Roman" w:hAnsi="HoloLens MDL2 Assets" w:cs="Times New Roman"/>
-        </w:rPr>
-      </w:pPr>
+        <w:spacing w:after="0"/>
+        <w:rPr>
+          <w:rFonts w:ascii="HoloLens MDL2 Assets" w:eastAsia="Times New Roman" w:hAnsi="HoloLens MDL2 Assets" w:cs="Times New Roman"/>
+          <w:sz w:val="18"/>
+          <w:szCs w:val="18"/>
+        </w:rPr>
+      </w:pPr>
+    </w:p>
+    <w:p>
+      <w:pPr>
+        <w:jc w:val="center"/>
+        <w:rPr>
+          <w:rFonts w:ascii="HoloLens MDL2 Assets" w:eastAsia="Times New Roman" w:hAnsi="HoloLens MDL2 Assets" w:cs="Times New Roman"/>
+          <w:b/>
+          <w:bCs/>
+          <w:i/>
+          <w:sz w:val="26"/>
+          <w:szCs w:val="24"/>
+        </w:rPr>
+      </w:pPr>
+      <w:r>
+        <w:rPr>
+          <w:rFonts w:ascii="HoloLens MDL2 Assets" w:eastAsia="Times New Roman" w:hAnsi="HoloLens MDL2 Assets" w:cs="Times New Roman"/>
+          <w:b/>
+          <w:bCs/>
+          <w:i/>
+          <w:sz w:val="26"/>
+          <w:szCs w:val="24"/>
+        </w:rPr>
+        <w:t xml:space="preserve">Personal Portfolio: </w:t>
+      </w:r>
+      <w:hyperlink r:id="rId5" w:history="1">
+        <w:r>
+          <w:rPr>
+            <w:rStyle w:val="Hyperlink"/>
+            <w:rFonts w:ascii="HoloLens MDL2 Assets" w:eastAsia="Times New Roman" w:hAnsi="HoloLens MDL2 Assets" w:cs="Times New Roman"/>
+            <w:b/>
+            <w:bCs/>
+            <w:i/>
+            <w:sz w:val="26"/>
+            <w:szCs w:val="24"/>
+          </w:rPr>
+          <w:t>https://biancafr</w:t>
+        </w:r>
+        <w:r>
+          <w:rPr>
+            <w:rStyle w:val="Hyperlink"/>
+            <w:rFonts w:ascii="HoloLens MDL2 Assets" w:eastAsia="Times New Roman" w:hAnsi="HoloLens MDL2 Assets" w:cs="Times New Roman"/>
+            <w:b/>
+            <w:bCs/>
+            <w:i/>
+            <w:sz w:val="26"/>
+            <w:szCs w:val="24"/>
+          </w:rPr>
+          <w:t>a</w:t>
+        </w:r>
+        <w:r>
+          <w:rPr>
+            <w:rStyle w:val="Hyperlink"/>
+            <w:rFonts w:ascii="HoloLens MDL2 Assets" w:eastAsia="Times New Roman" w:hAnsi="HoloLens MDL2 Assets" w:cs="Times New Roman"/>
+            <w:b/>
+            <w:bCs/>
+            <w:i/>
+            <w:sz w:val="26"/>
+            <w:szCs w:val="24"/>
+          </w:rPr>
+          <w:t>ntzeskakis.xyz</w:t>
+        </w:r>
+      </w:hyperlink>
     </w:p>
     <w:p>
       <w:pPr>
         <w:rPr>
           <w:rFonts w:ascii="HoloLens MDL2 Assets" w:eastAsia="Times New Roman" w:hAnsi="HoloLens MDL2 Assets" w:cs="Times New Roman"/>
           <w:iCs/>
+          <w:sz w:val="20"/>
+          <w:szCs w:val="20"/>
         </w:rPr>
       </w:pPr>
       <w:r>
@@ -447,8 +311,8 @@
           <w:b/>
           <w:bCs/>
           <w:i/>
-          <w:sz w:val="28"/>
-          <w:szCs w:val="28"/>
+          <w:sz w:val="26"/>
+          <w:szCs w:val="24"/>
         </w:rPr>
         <w:t>Education</w:t>
       </w:r>
@@ -470,7 +334,7 @@
           <w:bCs/>
           <w:iCs/>
         </w:rPr>
-        <w:t>University of Central Florida</w:t>
+        <w:t xml:space="preserve">University of Central Florida </w:t>
       </w:r>
       <w:r>
         <w:rPr>
@@ -479,7 +343,7 @@
           <w:bCs/>
           <w:iCs/>
         </w:rPr>
-        <w:t xml:space="preserve"> </w:t>
+        <w:tab/>
       </w:r>
       <w:r>
         <w:rPr>
@@ -513,79 +377,63 @@
           <w:rFonts w:ascii="HoloLens MDL2 Assets" w:eastAsia="Times New Roman" w:hAnsi="HoloLens MDL2 Assets" w:cs="Times New Roman"/>
           <w:b/>
           <w:bCs/>
+          <w:i/>
+        </w:rPr>
+        <w:tab/>
+      </w:r>
+      <w:r>
+        <w:rPr>
+          <w:rFonts w:ascii="HoloLens MDL2 Assets" w:eastAsia="Times New Roman" w:hAnsi="HoloLens MDL2 Assets" w:cs="Times New Roman"/>
+          <w:b/>
+          <w:bCs/>
+          <w:i/>
+        </w:rPr>
+        <w:tab/>
+      </w:r>
+      <w:r>
+        <w:rPr>
+          <w:rFonts w:ascii="HoloLens MDL2 Assets" w:eastAsia="Times New Roman" w:hAnsi="HoloLens MDL2 Assets" w:cs="Times New Roman"/>
+          <w:b/>
+          <w:bCs/>
+          <w:i/>
+        </w:rPr>
+        <w:t>Graduat</w:t>
+      </w:r>
+      <w:r>
+        <w:rPr>
+          <w:rFonts w:ascii="HoloLens MDL2 Assets" w:eastAsia="Times New Roman" w:hAnsi="HoloLens MDL2 Assets" w:cs="Times New Roman"/>
+          <w:b/>
+          <w:bCs/>
+          <w:i/>
+        </w:rPr>
+        <w:t>ed</w:t>
+      </w:r>
+      <w:r>
+        <w:rPr>
+          <w:rFonts w:ascii="HoloLens MDL2 Assets" w:eastAsia="Times New Roman" w:hAnsi="HoloLens MDL2 Assets" w:cs="Times New Roman"/>
+          <w:b/>
+          <w:bCs/>
+          <w:i/>
+        </w:rPr>
+        <w:t>: 05/2025</w:t>
+      </w:r>
+    </w:p>
+    <w:p>
+      <w:pPr>
+        <w:spacing w:after="0" w:line="240" w:lineRule="auto"/>
+        <w:rPr>
+          <w:rFonts w:ascii="HoloLens MDL2 Assets" w:eastAsia="Times New Roman" w:hAnsi="HoloLens MDL2 Assets" w:cs="Times New Roman"/>
+          <w:b/>
+          <w:bCs/>
+          <w:i/>
+        </w:rPr>
+      </w:pPr>
+      <w:r>
+        <w:rPr>
+          <w:rFonts w:ascii="HoloLens MDL2 Assets" w:eastAsia="Times New Roman" w:hAnsi="HoloLens MDL2 Assets" w:cs="Times New Roman"/>
           <w:iCs/>
         </w:rPr>
-        <w:tab/>
-      </w:r>
-      <w:r>
-        <w:rPr>
-          <w:rFonts w:ascii="HoloLens MDL2 Assets" w:eastAsia="Times New Roman" w:hAnsi="HoloLens MDL2 Assets" w:cs="Times New Roman"/>
-          <w:b/>
-          <w:bCs/>
-          <w:i/>
-        </w:rPr>
-        <w:tab/>
-      </w:r>
-      <w:r>
-        <w:rPr>
-          <w:rFonts w:ascii="HoloLens MDL2 Assets" w:eastAsia="Times New Roman" w:hAnsi="HoloLens MDL2 Assets" w:cs="Times New Roman"/>
-          <w:b/>
-          <w:bCs/>
-          <w:i/>
-        </w:rPr>
-        <w:tab/>
-      </w:r>
-      <w:r>
-        <w:rPr>
-          <w:rFonts w:ascii="HoloLens MDL2 Assets" w:eastAsia="Times New Roman" w:hAnsi="HoloLens MDL2 Assets" w:cs="Times New Roman"/>
-          <w:b/>
-          <w:bCs/>
-          <w:i/>
-        </w:rPr>
-        <w:t>Graduat</w:t>
-      </w:r>
-      <w:r>
-        <w:rPr>
-          <w:rFonts w:ascii="HoloLens MDL2 Assets" w:eastAsia="Times New Roman" w:hAnsi="HoloLens MDL2 Assets" w:cs="Times New Roman"/>
-          <w:b/>
-          <w:bCs/>
-          <w:i/>
-        </w:rPr>
-        <w:t>ed</w:t>
-      </w:r>
-      <w:r>
-        <w:rPr>
-          <w:rFonts w:ascii="HoloLens MDL2 Assets" w:eastAsia="Times New Roman" w:hAnsi="HoloLens MDL2 Assets" w:cs="Times New Roman"/>
-          <w:b/>
-          <w:bCs/>
-          <w:i/>
-        </w:rPr>
-        <w:t>: 05/2025</w:t>
-      </w:r>
-    </w:p>
-    <w:p>
-      <w:pPr>
-        <w:spacing w:after="0" w:line="240" w:lineRule="auto"/>
-        <w:rPr>
-          <w:rFonts w:ascii="HoloLens MDL2 Assets" w:eastAsia="Times New Roman" w:hAnsi="HoloLens MDL2 Assets" w:cs="Times New Roman"/>
-          <w:b/>
-          <w:bCs/>
-          <w:i/>
-        </w:rPr>
-      </w:pPr>
-      <w:r>
-        <w:rPr>
-          <w:rFonts w:ascii="HoloLens MDL2 Assets" w:eastAsia="Times New Roman" w:hAnsi="HoloLens MDL2 Assets" w:cs="Times New Roman"/>
-          <w:iCs/>
-        </w:rPr>
-        <w:t>B.S. Computer Scien</w:t>
-      </w:r>
-      <w:r>
-        <w:rPr>
-          <w:rFonts w:ascii="HoloLens MDL2 Assets" w:eastAsia="Times New Roman" w:hAnsi="HoloLens MDL2 Assets" w:cs="Times New Roman"/>
-          <w:iCs/>
-        </w:rPr>
-        <w:t>ce; 3.6 GPA</w:t>
+        <w:t>B.S. Computer Science; 3.6 GPA</w:t>
       </w:r>
     </w:p>
     <w:p>
@@ -623,14 +471,7 @@
           <w:rFonts w:ascii="HoloLens MDL2 Assets" w:eastAsia="Times New Roman" w:hAnsi="HoloLens MDL2 Assets" w:cs="Times New Roman"/>
           <w:iCs/>
         </w:rPr>
-        <w:t>Algorithms in Machine Learning</w:t>
-      </w:r>
-      <w:r>
-        <w:rPr>
-          <w:rFonts w:ascii="HoloLens MDL2 Assets" w:eastAsia="Times New Roman" w:hAnsi="HoloLens MDL2 Assets" w:cs="Times New Roman"/>
-          <w:iCs/>
-        </w:rPr>
-        <w:t>, Systems Software</w:t>
+        <w:t>Algorithms in Machine Learning, Systems Software</w:t>
       </w:r>
       <w:r>
         <w:rPr>
@@ -680,15 +521,7 @@
           <w:kern w:val="0"/>
           <w14:ligatures w14:val="none"/>
         </w:rPr>
-        <w:t xml:space="preserve"> </w:t>
-      </w:r>
-      <w:r>
-        <w:rPr>
-          <w:rFonts w:ascii="HoloLens MDL2 Assets" w:eastAsia="Times New Roman" w:hAnsi="HoloLens MDL2 Assets" w:cs="Times New Roman"/>
-          <w:kern w:val="0"/>
-          <w14:ligatures w14:val="none"/>
-        </w:rPr>
-        <w:t>The National Society of Leadership and Success Club Member since Spring 2023</w:t>
+        <w:t xml:space="preserve"> The National Society of Leadership and Success Club Member since Spring 2023</w:t>
       </w:r>
       <w:r>
         <w:rPr>
@@ -816,15 +649,7 @@
           <w:b/>
           <w:i/>
         </w:rPr>
-        <w:t>07/</w:t>
-      </w:r>
-      <w:r>
-        <w:rPr>
-          <w:rFonts w:ascii="HoloLens MDL2 Assets" w:eastAsia="Times New Roman" w:hAnsi="HoloLens MDL2 Assets" w:cs="Times New Roman"/>
-          <w:b/>
-          <w:i/>
-        </w:rPr>
-        <w:t>2021</w:t>
+        <w:t>07/2021</w:t>
       </w:r>
       <w:r>
         <w:rPr>
@@ -948,6 +773,8 @@
           <w:b/>
           <w:i/>
           <w:kern w:val="0"/>
+          <w:sz w:val="20"/>
+          <w:szCs w:val="20"/>
           <w14:ligatures w14:val="none"/>
         </w:rPr>
       </w:pPr>
@@ -958,13 +785,12 @@
           <w:b/>
           <w:bCs/>
           <w:i/>
-          <w:sz w:val="28"/>
-          <w:szCs w:val="28"/>
+          <w:sz w:val="26"/>
+          <w:szCs w:val="24"/>
         </w:rPr>
         <w:t>Work Experience</w:t>
       </w:r>
     </w:p>
-    <w:bookmarkEnd w:id="0"/>
     <w:p>
       <w:pPr>
         <w:spacing w:after="0" w:line="240" w:lineRule="auto"/>
@@ -976,6 +802,8 @@
           <w14:ligatures w14:val="none"/>
         </w:rPr>
       </w:pPr>
+      <w:bookmarkStart w:id="1" w:name="_Hlk206188523"/>
+      <w:bookmarkEnd w:id="0"/>
       <w:r>
         <w:rPr>
           <w:rFonts w:ascii="HoloLens MDL2 Assets" w:eastAsia="Times New Roman" w:hAnsi="HoloLens MDL2 Assets" w:cs="Times New Roman"/>
@@ -984,7 +812,7 @@
           <w:kern w:val="0"/>
           <w14:ligatures w14:val="none"/>
         </w:rPr>
-        <w:t>Algebra Tutor: Robinswood Middle School</w:t>
+        <w:t>Freelance Software Developer: Remote</w:t>
       </w:r>
       <w:r>
         <w:rPr>
@@ -1000,7 +828,7 @@
         <w:rPr>
           <w:rFonts w:ascii="HoloLens MDL2 Assets" w:eastAsia="Times New Roman" w:hAnsi="HoloLens MDL2 Assets" w:cs="Times New Roman"/>
           <w:b/>
-          <w:i/>
+          <w:iCs/>
           <w:kern w:val="0"/>
           <w14:ligatures w14:val="none"/>
         </w:rPr>
@@ -1035,31 +863,51 @@
           <w14:ligatures w14:val="none"/>
         </w:rPr>
         <w:tab/>
-        <w:t>11/</w:t>
-      </w:r>
-      <w:r>
-        <w:rPr>
-          <w:rFonts w:ascii="HoloLens MDL2 Assets" w:eastAsia="Times New Roman" w:hAnsi="HoloLens MDL2 Assets" w:cs="Times New Roman"/>
-          <w:b/>
-          <w:i/>
-          <w:kern w:val="0"/>
-          <w14:ligatures w14:val="none"/>
-        </w:rPr>
-        <w:t xml:space="preserve">2023 - </w:t>
-      </w:r>
-      <w:r>
-        <w:rPr>
-          <w:rFonts w:ascii="HoloLens MDL2 Assets" w:eastAsia="Times New Roman" w:hAnsi="HoloLens MDL2 Assets" w:cs="Times New Roman"/>
-          <w:b/>
-          <w:i/>
-          <w:kern w:val="0"/>
-          <w14:ligatures w14:val="none"/>
-        </w:rPr>
-        <w:t>present</w:t>
-      </w:r>
-    </w:p>
-    <w:p>
-      <w:pPr>
+      </w:r>
+      <w:r>
+        <w:rPr>
+          <w:rFonts w:ascii="HoloLens MDL2 Assets" w:eastAsia="Times New Roman" w:hAnsi="HoloLens MDL2 Assets" w:cs="Times New Roman"/>
+          <w:b/>
+          <w:i/>
+          <w:kern w:val="0"/>
+          <w14:ligatures w14:val="none"/>
+        </w:rPr>
+        <w:t>05</w:t>
+      </w:r>
+      <w:r>
+        <w:rPr>
+          <w:rFonts w:ascii="HoloLens MDL2 Assets" w:eastAsia="Times New Roman" w:hAnsi="HoloLens MDL2 Assets" w:cs="Times New Roman"/>
+          <w:b/>
+          <w:i/>
+          <w:kern w:val="0"/>
+          <w14:ligatures w14:val="none"/>
+        </w:rPr>
+        <w:t>/202</w:t>
+      </w:r>
+      <w:r>
+        <w:rPr>
+          <w:rFonts w:ascii="HoloLens MDL2 Assets" w:eastAsia="Times New Roman" w:hAnsi="HoloLens MDL2 Assets" w:cs="Times New Roman"/>
+          <w:b/>
+          <w:i/>
+          <w:kern w:val="0"/>
+          <w14:ligatures w14:val="none"/>
+        </w:rPr>
+        <w:t>4</w:t>
+      </w:r>
+      <w:r>
+        <w:rPr>
+          <w:rFonts w:ascii="HoloLens MDL2 Assets" w:eastAsia="Times New Roman" w:hAnsi="HoloLens MDL2 Assets" w:cs="Times New Roman"/>
+          <w:b/>
+          <w:i/>
+          <w:kern w:val="0"/>
+          <w14:ligatures w14:val="none"/>
+        </w:rPr>
+        <w:t xml:space="preserve"> - present</w:t>
+      </w:r>
+    </w:p>
+    <w:p>
+      <w:pPr>
+        <w:pStyle w:val="ListParagraph"/>
         <w:numPr>
           <w:ilvl w:val="0"/>
           <w:numId w:val="2"/>
@@ -1087,23 +935,98 @@
           <w:kern w:val="0"/>
           <w14:ligatures w14:val="none"/>
         </w:rPr>
-        <w:t xml:space="preserve">Fostered a constructive learning environment through personalized </w:t>
-      </w:r>
-      <w:r>
-        <w:rPr>
-          <w:rFonts w:ascii="HoloLens MDL2 Assets" w:eastAsia="Times New Roman" w:hAnsi="HoloLens MDL2 Assets" w:cs="Times New Roman"/>
-          <w:kern w:val="0"/>
-          <w14:ligatures w14:val="none"/>
-        </w:rPr>
-        <w:t xml:space="preserve">tutoring </w:t>
-      </w:r>
-    </w:p>
-    <w:p>
-      <w:pPr>
+        <w:t xml:space="preserve">Designed and deployed websites using </w:t>
+      </w:r>
+      <w:proofErr w:type="spellStart"/>
+      <w:r>
+        <w:rPr>
+          <w:rFonts w:ascii="HoloLens MDL2 Assets" w:eastAsia="Times New Roman" w:hAnsi="HoloLens MDL2 Assets" w:cs="Times New Roman"/>
+          <w:kern w:val="0"/>
+          <w14:ligatures w14:val="none"/>
+        </w:rPr>
+        <w:t>DigitalOcean</w:t>
+      </w:r>
+      <w:proofErr w:type="spellEnd"/>
+      <w:r>
+        <w:rPr>
+          <w:rFonts w:ascii="HoloLens MDL2 Assets" w:eastAsia="Times New Roman" w:hAnsi="HoloLens MDL2 Assets" w:cs="Times New Roman"/>
+          <w:kern w:val="0"/>
+          <w14:ligatures w14:val="none"/>
+        </w:rPr>
+        <w:t xml:space="preserve"> hosting</w:t>
+      </w:r>
+    </w:p>
+    <w:p>
+      <w:pPr>
+        <w:pStyle w:val="ListParagraph"/>
         <w:numPr>
           <w:ilvl w:val="0"/>
           <w:numId w:val="2"/>
         </w:numPr>
+        <w:rPr>
+          <w:rFonts w:ascii="HoloLens MDL2 Assets" w:eastAsia="Times New Roman" w:hAnsi="HoloLens MDL2 Assets" w:cs="Times New Roman"/>
+          <w:kern w:val="0"/>
+          <w14:ligatures w14:val="none"/>
+        </w:rPr>
+      </w:pPr>
+      <w:r>
+        <w:rPr>
+          <w:rFonts w:ascii="HoloLens MDL2 Assets" w:eastAsia="Times New Roman" w:hAnsi="HoloLens MDL2 Assets" w:cs="Times New Roman"/>
+          <w:kern w:val="0"/>
+          <w14:ligatures w14:val="none"/>
+        </w:rPr>
+        <w:t xml:space="preserve">Implemented responsive web design for cross-device compatibility </w:t>
+      </w:r>
+      <w:r>
+        <w:rPr>
+          <w:rFonts w:ascii="HoloLens MDL2 Assets" w:eastAsia="Times New Roman" w:hAnsi="HoloLens MDL2 Assets" w:cs="Times New Roman"/>
+          <w:kern w:val="0"/>
+          <w14:ligatures w14:val="none"/>
+        </w:rPr>
+        <w:t xml:space="preserve">with </w:t>
+      </w:r>
+      <w:r>
+        <w:rPr>
+          <w:rFonts w:ascii="HoloLens MDL2 Assets" w:eastAsia="Times New Roman" w:hAnsi="HoloLens MDL2 Assets" w:cs="Times New Roman"/>
+          <w:kern w:val="0"/>
+          <w14:ligatures w14:val="none"/>
+        </w:rPr>
+        <w:t>interactive UI components</w:t>
+      </w:r>
+    </w:p>
+    <w:p>
+      <w:pPr>
+        <w:pStyle w:val="ListParagraph"/>
+        <w:numPr>
+          <w:ilvl w:val="0"/>
+          <w:numId w:val="2"/>
+        </w:numPr>
+        <w:rPr>
+          <w:rFonts w:ascii="HoloLens MDL2 Assets" w:eastAsia="Times New Roman" w:hAnsi="HoloLens MDL2 Assets" w:cs="Times New Roman"/>
+          <w:kern w:val="0"/>
+          <w14:ligatures w14:val="none"/>
+        </w:rPr>
+      </w:pPr>
+      <w:r>
+        <w:rPr>
+          <w:rFonts w:ascii="HoloLens MDL2 Assets" w:eastAsia="Times New Roman" w:hAnsi="HoloLens MDL2 Assets" w:cs="Times New Roman"/>
+          <w:kern w:val="0"/>
+          <w14:ligatures w14:val="none"/>
+        </w:rPr>
+        <w:t>Conducted independent research to learn and apply emerging web frameworks and deployment strategie</w:t>
+      </w:r>
+      <w:r>
+        <w:rPr>
+          <w:rFonts w:ascii="HoloLens MDL2 Assets" w:eastAsia="Times New Roman" w:hAnsi="HoloLens MDL2 Assets" w:cs="Times New Roman"/>
+          <w:kern w:val="0"/>
+          <w14:ligatures w14:val="none"/>
+        </w:rPr>
+        <w:t>s</w:t>
+      </w:r>
+    </w:p>
+    <w:bookmarkEnd w:id="1"/>
+    <w:p>
+      <w:pPr>
         <w:pBdr>
           <w:top w:val="nil"/>
           <w:left w:val="nil"/>
@@ -1114,111 +1037,6 @@
         <w:spacing w:after="0" w:line="240" w:lineRule="auto"/>
         <w:rPr>
           <w:rFonts w:ascii="HoloLens MDL2 Assets" w:eastAsia="Times New Roman" w:hAnsi="HoloLens MDL2 Assets" w:cs="Times New Roman"/>
-          <w:b/>
-          <w:i/>
-          <w:color w:val="000000"/>
-          <w:kern w:val="0"/>
-          <w14:ligatures w14:val="none"/>
-        </w:rPr>
-      </w:pPr>
-      <w:r>
-        <w:rPr>
-          <w:rFonts w:ascii="HoloLens MDL2 Assets" w:eastAsia="Times New Roman" w:hAnsi="HoloLens MDL2 Assets" w:cs="Times New Roman"/>
-          <w:kern w:val="0"/>
-          <w14:ligatures w14:val="none"/>
-        </w:rPr>
-        <w:t>Adapted</w:t>
-      </w:r>
-      <w:r>
-        <w:rPr>
-          <w:rFonts w:ascii="HoloLens MDL2 Assets" w:eastAsia="Times New Roman" w:hAnsi="HoloLens MDL2 Assets" w:cs="Times New Roman"/>
-          <w:kern w:val="0"/>
-          <w14:ligatures w14:val="none"/>
-        </w:rPr>
-        <w:t xml:space="preserve"> creative teaching </w:t>
-      </w:r>
-      <w:r>
-        <w:rPr>
-          <w:rFonts w:ascii="HoloLens MDL2 Assets" w:eastAsia="Times New Roman" w:hAnsi="HoloLens MDL2 Assets" w:cs="Times New Roman"/>
-          <w:kern w:val="0"/>
-          <w14:ligatures w14:val="none"/>
-        </w:rPr>
-        <w:t>strategies</w:t>
-      </w:r>
-      <w:r>
-        <w:rPr>
-          <w:rFonts w:ascii="HoloLens MDL2 Assets" w:eastAsia="Times New Roman" w:hAnsi="HoloLens MDL2 Assets" w:cs="Times New Roman"/>
-          <w:kern w:val="0"/>
-          <w14:ligatures w14:val="none"/>
-        </w:rPr>
-        <w:t xml:space="preserve"> to </w:t>
-      </w:r>
-      <w:r>
-        <w:rPr>
-          <w:rFonts w:ascii="HoloLens MDL2 Assets" w:eastAsia="Times New Roman" w:hAnsi="HoloLens MDL2 Assets" w:cs="Times New Roman"/>
-          <w:kern w:val="0"/>
-          <w14:ligatures w14:val="none"/>
-        </w:rPr>
-        <w:t>diverse</w:t>
-      </w:r>
-      <w:r>
-        <w:rPr>
-          <w:rFonts w:ascii="HoloLens MDL2 Assets" w:eastAsia="Times New Roman" w:hAnsi="HoloLens MDL2 Assets" w:cs="Times New Roman"/>
-          <w:kern w:val="0"/>
-          <w14:ligatures w14:val="none"/>
-        </w:rPr>
-        <w:t xml:space="preserve"> learning styles</w:t>
-      </w:r>
-    </w:p>
-    <w:p>
-      <w:pPr>
-        <w:numPr>
-          <w:ilvl w:val="0"/>
-          <w:numId w:val="2"/>
-        </w:numPr>
-        <w:pBdr>
-          <w:top w:val="nil"/>
-          <w:left w:val="nil"/>
-          <w:bottom w:val="nil"/>
-          <w:right w:val="nil"/>
-          <w:between w:val="nil"/>
-        </w:pBdr>
-        <w:spacing w:after="0" w:line="240" w:lineRule="auto"/>
-        <w:rPr>
-          <w:rFonts w:ascii="HoloLens MDL2 Assets" w:eastAsia="Times New Roman" w:hAnsi="HoloLens MDL2 Assets" w:cs="Times New Roman"/>
-          <w:kern w:val="0"/>
-          <w14:ligatures w14:val="none"/>
-        </w:rPr>
-      </w:pPr>
-      <w:r>
-        <w:rPr>
-          <w:rFonts w:ascii="HoloLens MDL2 Assets" w:eastAsia="Times New Roman" w:hAnsi="HoloLens MDL2 Assets" w:cs="Times New Roman"/>
-          <w:kern w:val="0"/>
-          <w14:ligatures w14:val="none"/>
-        </w:rPr>
-        <w:t>Worked in tandem with educators to deliver comprehensive support</w:t>
-      </w:r>
-      <w:r>
-        <w:rPr>
-          <w:rFonts w:ascii="HoloLens MDL2 Assets" w:eastAsia="Times New Roman" w:hAnsi="HoloLens MDL2 Assets" w:cs="Times New Roman"/>
-          <w:kern w:val="0"/>
-          <w14:ligatures w14:val="none"/>
-        </w:rPr>
-        <w:br/>
-      </w:r>
-    </w:p>
-    <w:p>
-      <w:pPr>
-        <w:pBdr>
-          <w:top w:val="nil"/>
-          <w:left w:val="nil"/>
-          <w:bottom w:val="nil"/>
-          <w:right w:val="nil"/>
-          <w:between w:val="nil"/>
-        </w:pBdr>
-        <w:spacing w:after="0" w:line="240" w:lineRule="auto"/>
-        <w:rPr>
-          <w:rFonts w:ascii="HoloLens MDL2 Assets" w:eastAsia="Times New Roman" w:hAnsi="HoloLens MDL2 Assets" w:cs="Times New Roman"/>
           <w:bCs/>
           <w:i/>
           <w:kern w:val="0"/>
@@ -1233,27 +1051,7 @@
           <w:kern w:val="0"/>
           <w14:ligatures w14:val="none"/>
         </w:rPr>
-        <w:t xml:space="preserve">Transcriptionist/Medical Assistant: </w:t>
-      </w:r>
-      <w:r>
-        <w:rPr>
-          <w:rFonts w:ascii="HoloLens MDL2 Assets" w:eastAsia="Times New Roman" w:hAnsi="HoloLens MDL2 Assets" w:cs="Times New Roman"/>
-          <w:b/>
-          <w:iCs/>
-          <w:kern w:val="0"/>
-          <w14:ligatures w14:val="none"/>
-        </w:rPr>
-        <w:t>AAIC</w:t>
-      </w:r>
-      <w:r>
-        <w:rPr>
-          <w:rFonts w:ascii="HoloLens MDL2 Assets" w:eastAsia="Times New Roman" w:hAnsi="HoloLens MDL2 Assets" w:cs="Times New Roman"/>
-          <w:b/>
-          <w:iCs/>
-          <w:kern w:val="0"/>
-          <w14:ligatures w14:val="none"/>
-        </w:rPr>
-        <w:t xml:space="preserve"> of Central Fl</w:t>
+        <w:t>Transcriptionist/Medical Assistant: AAIC of Central Fl</w:t>
       </w:r>
       <w:r>
         <w:rPr>
@@ -1304,17 +1102,7 @@
           <w:kern w:val="0"/>
           <w14:ligatures w14:val="none"/>
         </w:rPr>
-        <w:t xml:space="preserve"> </w:t>
-      </w:r>
-      <w:r>
-        <w:rPr>
-          <w:rFonts w:ascii="HoloLens MDL2 Assets" w:eastAsia="Times New Roman" w:hAnsi="HoloLens MDL2 Assets" w:cs="Times New Roman"/>
-          <w:b/>
-          <w:i/>
-          <w:kern w:val="0"/>
-          <w14:ligatures w14:val="none"/>
-        </w:rPr>
-        <w:t>present</w:t>
+        <w:t xml:space="preserve"> present</w:t>
       </w:r>
       <w:r>
         <w:rPr>
@@ -1364,31 +1152,7 @@
           <w:kern w:val="0"/>
           <w14:ligatures w14:val="none"/>
         </w:rPr>
-        <w:t>y</w:t>
-      </w:r>
-      <w:r>
-        <w:rPr>
-          <w:rFonts w:ascii="HoloLens MDL2 Assets" w:eastAsia="Times New Roman" w:hAnsi="HoloLens MDL2 Assets" w:cs="Times New Roman"/>
-          <w:kern w:val="0"/>
-          <w14:ligatures w14:val="none"/>
-        </w:rPr>
-        <w:t xml:space="preserve">, </w:t>
-      </w:r>
-      <w:r>
-        <w:rPr>
-          <w:rFonts w:ascii="HoloLens MDL2 Assets" w:eastAsia="Times New Roman" w:hAnsi="HoloLens MDL2 Assets" w:cs="Times New Roman"/>
-          <w:kern w:val="0"/>
-          <w14:ligatures w14:val="none"/>
-        </w:rPr>
-        <w:t>took vitals</w:t>
-      </w:r>
-      <w:r>
-        <w:rPr>
-          <w:rFonts w:ascii="HoloLens MDL2 Assets" w:eastAsia="Times New Roman" w:hAnsi="HoloLens MDL2 Assets" w:cs="Times New Roman"/>
-          <w:kern w:val="0"/>
-          <w14:ligatures w14:val="none"/>
-        </w:rPr>
-        <w:t>, sent e-prescriptions/wrote prescriptions</w:t>
+        <w:t>y, took vitals, sent e-prescriptions/wrote prescriptions</w:t>
       </w:r>
     </w:p>
     <w:p>
@@ -1444,7 +1208,7 @@
           <w14:ligatures w14:val="none"/>
         </w:rPr>
       </w:pPr>
-      <w:bookmarkStart w:id="1" w:name="_Hlk159066972"/>
+      <w:bookmarkStart w:id="2" w:name="_Hlk159066972"/>
       <w:r>
         <w:rPr>
           <w:rFonts w:ascii="HoloLens MDL2 Assets" w:eastAsia="Times New Roman" w:hAnsi="HoloLens MDL2 Assets" w:cs="Times New Roman"/>
@@ -1454,7 +1218,7 @@
         </w:rPr>
         <w:t>Assisted doctor in the room with patients</w:t>
       </w:r>
-      <w:bookmarkEnd w:id="1"/>
+      <w:bookmarkEnd w:id="2"/>
       <w:r>
         <w:rPr>
           <w:rFonts w:ascii="HoloLens MDL2 Assets" w:eastAsia="Times New Roman" w:hAnsi="HoloLens MDL2 Assets" w:cs="Times New Roman"/>
@@ -1472,353 +1236,277 @@
           <w:rFonts w:ascii="HoloLens MDL2 Assets" w:eastAsia="Times New Roman" w:hAnsi="HoloLens MDL2 Assets" w:cs="Times New Roman"/>
           <w:b/>
           <w:i/>
-          <w:kern w:val="0"/>
-          <w14:ligatures w14:val="none"/>
-        </w:rPr>
-      </w:pPr>
-      <w:r>
-        <w:rPr>
-          <w:rFonts w:ascii="HoloLens MDL2 Assets" w:eastAsia="Times New Roman" w:hAnsi="HoloLens MDL2 Assets" w:cs="Times New Roman"/>
-          <w:b/>
-          <w:bCs/>
-          <w:i/>
-          <w:sz w:val="28"/>
-          <w:szCs w:val="28"/>
-        </w:rPr>
-        <w:t>Skills</w:t>
-      </w:r>
-    </w:p>
-    <w:p>
-      <w:pPr>
-        <w:spacing w:after="0" w:line="240" w:lineRule="auto"/>
-        <w:rPr>
-          <w:rFonts w:ascii="Cambria" w:eastAsia="Times New Roman" w:hAnsi="Cambria" w:cs="Times New Roman"/>
-          <w:kern w:val="0"/>
-          <w14:ligatures w14:val="none"/>
-        </w:rPr>
-      </w:pPr>
-      <w:r>
-        <w:rPr>
-          <w:rFonts w:ascii="HoloLens MDL2 Assets" w:eastAsia="Times New Roman" w:hAnsi="HoloLens MDL2 Assets" w:cs="Times New Roman"/>
-          <w:b/>
-          <w:kern w:val="0"/>
-          <w14:ligatures w14:val="none"/>
-        </w:rPr>
-        <w:t>Programming:</w:t>
-      </w:r>
-      <w:r>
-        <w:rPr>
-          <w:rFonts w:ascii="HoloLens MDL2 Assets" w:eastAsia="Times New Roman" w:hAnsi="HoloLens MDL2 Assets" w:cs="Times New Roman"/>
-          <w:kern w:val="0"/>
-          <w14:ligatures w14:val="none"/>
-        </w:rPr>
-        <w:t xml:space="preserve"> Python</w:t>
-      </w:r>
-      <w:r>
-        <w:rPr>
-          <w:rFonts w:ascii="HoloLens MDL2 Assets" w:eastAsia="Times New Roman" w:hAnsi="HoloLens MDL2 Assets" w:cs="Times New Roman"/>
-          <w:kern w:val="0"/>
-          <w14:ligatures w14:val="none"/>
-        </w:rPr>
-        <w:t>,</w:t>
-      </w:r>
-      <w:r>
-        <w:rPr>
-          <w:rFonts w:ascii="HoloLens MDL2 Assets" w:eastAsia="Times New Roman" w:hAnsi="HoloLens MDL2 Assets" w:cs="Times New Roman"/>
-          <w:kern w:val="0"/>
-          <w14:ligatures w14:val="none"/>
-        </w:rPr>
-        <w:t xml:space="preserve"> </w:t>
-      </w:r>
-      <w:r>
-        <w:rPr>
-          <w:rFonts w:ascii="HoloLens MDL2 Assets" w:eastAsia="Times New Roman" w:hAnsi="HoloLens MDL2 Assets" w:cs="Times New Roman"/>
-          <w:kern w:val="0"/>
-          <w14:ligatures w14:val="none"/>
-        </w:rPr>
-        <w:t xml:space="preserve">Java, </w:t>
-      </w:r>
-      <w:r>
-        <w:rPr>
-          <w:rFonts w:ascii="HoloLens MDL2 Assets" w:eastAsia="Times New Roman" w:hAnsi="HoloLens MDL2 Assets" w:cs="Times New Roman"/>
-          <w:kern w:val="0"/>
-          <w14:ligatures w14:val="none"/>
-        </w:rPr>
-        <w:t>C, C#, C++,</w:t>
-      </w:r>
-      <w:r>
-        <w:rPr>
-          <w:rFonts w:ascii="HoloLens MDL2 Assets" w:eastAsia="Times New Roman" w:hAnsi="HoloLens MDL2 Assets" w:cs="Times New Roman"/>
-          <w:kern w:val="0"/>
-          <w14:ligatures w14:val="none"/>
-        </w:rPr>
-        <w:t xml:space="preserve"> JavaScript, TypeScript,</w:t>
-      </w:r>
-      <w:r>
-        <w:rPr>
-          <w:rFonts w:ascii="HoloLens MDL2 Assets" w:eastAsia="Times New Roman" w:hAnsi="HoloLens MDL2 Assets" w:cs="Times New Roman"/>
-          <w:kern w:val="0"/>
-          <w14:ligatures w14:val="none"/>
-        </w:rPr>
-        <w:t xml:space="preserve"> HTML</w:t>
-      </w:r>
-      <w:r>
-        <w:rPr>
-          <w:rFonts w:ascii="Cambria" w:eastAsia="Times New Roman" w:hAnsi="Cambria" w:cs="Times New Roman"/>
-          <w:kern w:val="0"/>
-          <w14:ligatures w14:val="none"/>
-        </w:rPr>
-        <w:t>/</w:t>
-      </w:r>
-      <w:r>
-        <w:rPr>
-          <w:rFonts w:ascii="HoloLens MDL2 Assets" w:eastAsia="Times New Roman" w:hAnsi="HoloLens MDL2 Assets" w:cs="Times New Roman"/>
-          <w:kern w:val="0"/>
-          <w14:ligatures w14:val="none"/>
-        </w:rPr>
-        <w:t>CSS</w:t>
-      </w:r>
-      <w:r>
-        <w:rPr>
-          <w:rFonts w:ascii="Cambria" w:eastAsia="Times New Roman" w:hAnsi="Cambria" w:cs="Times New Roman"/>
-          <w:kern w:val="0"/>
-          <w14:ligatures w14:val="none"/>
-        </w:rPr>
-        <w:t xml:space="preserve">, </w:t>
-      </w:r>
-      <w:r>
-        <w:rPr>
-          <w:rFonts w:ascii="Cambria" w:eastAsia="Times New Roman" w:hAnsi="Cambria" w:cs="Times New Roman"/>
-          <w:kern w:val="0"/>
-          <w14:ligatures w14:val="none"/>
-        </w:rPr>
-        <w:t>SQL</w:t>
-      </w:r>
-      <w:r>
-        <w:rPr>
-          <w:rFonts w:ascii="Cambria" w:eastAsia="Times New Roman" w:hAnsi="Cambria" w:cs="Times New Roman"/>
-          <w:kern w:val="0"/>
-          <w14:ligatures w14:val="none"/>
-        </w:rPr>
-        <w:t xml:space="preserve">, </w:t>
-      </w:r>
-      <w:r>
-        <w:rPr>
-          <w:rFonts w:ascii="Cambria" w:eastAsia="Times New Roman" w:hAnsi="Cambria" w:cs="Times New Roman"/>
-          <w:kern w:val="0"/>
-          <w14:ligatures w14:val="none"/>
-        </w:rPr>
-        <w:t xml:space="preserve">React, </w:t>
-      </w:r>
-      <w:r>
-        <w:rPr>
-          <w:rFonts w:ascii="Cambria" w:eastAsia="Times New Roman" w:hAnsi="Cambria" w:cs="Times New Roman"/>
-          <w:kern w:val="0"/>
-          <w14:ligatures w14:val="none"/>
-        </w:rPr>
-        <w:t>Flutter</w:t>
-      </w:r>
-    </w:p>
-    <w:p>
-      <w:pPr>
-        <w:spacing w:after="0" w:line="240" w:lineRule="auto"/>
-        <w:rPr>
-          <w:rFonts w:ascii="Cambria" w:eastAsia="Times New Roman" w:hAnsi="Cambria" w:cs="Times New Roman"/>
-          <w:kern w:val="0"/>
-          <w14:ligatures w14:val="none"/>
-        </w:rPr>
-      </w:pPr>
-      <w:r>
-        <w:rPr>
-          <w:rFonts w:ascii="Cambria" w:eastAsia="Times New Roman" w:hAnsi="Cambria" w:cs="Times New Roman"/>
-          <w:b/>
-          <w:bCs/>
-          <w:kern w:val="0"/>
-          <w14:ligatures w14:val="none"/>
-        </w:rPr>
-        <w:t>Tools</w:t>
-      </w:r>
-      <w:r>
-        <w:rPr>
-          <w:rFonts w:ascii="Cambria" w:eastAsia="Times New Roman" w:hAnsi="Cambria" w:cs="Times New Roman"/>
-          <w:b/>
-          <w:bCs/>
-          <w:kern w:val="0"/>
-          <w14:ligatures w14:val="none"/>
-        </w:rPr>
-        <w:t>:</w:t>
-      </w:r>
-      <w:r>
-        <w:rPr>
-          <w:rFonts w:ascii="Cambria" w:eastAsia="Times New Roman" w:hAnsi="Cambria" w:cs="Times New Roman"/>
-          <w:kern w:val="0"/>
-          <w14:ligatures w14:val="none"/>
-        </w:rPr>
-        <w:t xml:space="preserve"> </w:t>
-      </w:r>
-      <w:r>
-        <w:rPr>
-          <w:rFonts w:ascii="Cambria" w:eastAsia="Times New Roman" w:hAnsi="Cambria" w:cs="Times New Roman"/>
-          <w:kern w:val="0"/>
-          <w14:ligatures w14:val="none"/>
-        </w:rPr>
-        <w:t>PuTTY, Postman, SwaggerHub, PowerShell/Command Line (CLI), Jira</w:t>
-      </w:r>
-    </w:p>
-    <w:p>
-      <w:pPr>
-        <w:spacing w:after="0" w:line="240" w:lineRule="auto"/>
-        <w:rPr>
-          <w:rFonts w:ascii="Cambria" w:eastAsia="Times New Roman" w:hAnsi="Cambria" w:cs="Times New Roman"/>
-          <w:kern w:val="0"/>
-          <w14:ligatures w14:val="none"/>
-        </w:rPr>
-      </w:pPr>
-      <w:r>
-        <w:rPr>
-          <w:rFonts w:ascii="Cambria" w:eastAsia="Times New Roman" w:hAnsi="Cambria" w:cs="Times New Roman"/>
-          <w:b/>
-          <w:bCs/>
-          <w:kern w:val="0"/>
-          <w14:ligatures w14:val="none"/>
-        </w:rPr>
-        <w:t>Troubleshooting:</w:t>
-      </w:r>
-      <w:r>
-        <w:rPr>
-          <w:rFonts w:ascii="Cambria" w:eastAsia="Times New Roman" w:hAnsi="Cambria" w:cs="Times New Roman"/>
-          <w:kern w:val="0"/>
-          <w14:ligatures w14:val="none"/>
-        </w:rPr>
-        <w:t xml:space="preserve"> Debugging software/hardware integrations, </w:t>
-      </w:r>
-      <w:r>
-        <w:rPr>
-          <w:rFonts w:ascii="Cambria" w:eastAsia="Times New Roman" w:hAnsi="Cambria" w:cs="Times New Roman"/>
-          <w:kern w:val="0"/>
-          <w14:ligatures w14:val="none"/>
-        </w:rPr>
-        <w:t>debugging system errors</w:t>
-      </w:r>
-    </w:p>
-    <w:p>
-      <w:pPr>
-        <w:spacing w:after="0" w:line="240" w:lineRule="auto"/>
-        <w:rPr>
-          <w:rFonts w:ascii="HoloLens MDL2 Assets" w:eastAsia="Times New Roman" w:hAnsi="HoloLens MDL2 Assets" w:cs="Times New Roman"/>
-          <w:kern w:val="0"/>
-          <w14:ligatures w14:val="none"/>
-        </w:rPr>
-      </w:pPr>
-      <w:r>
-        <w:rPr>
-          <w:rFonts w:ascii="HoloLens MDL2 Assets" w:eastAsia="Times New Roman" w:hAnsi="HoloLens MDL2 Assets" w:cs="Times New Roman"/>
-          <w:b/>
-          <w:kern w:val="0"/>
-          <w14:ligatures w14:val="none"/>
-        </w:rPr>
-        <w:t>Other:</w:t>
-      </w:r>
-      <w:r>
-        <w:rPr>
-          <w:rFonts w:ascii="HoloLens MDL2 Assets" w:eastAsia="Times New Roman" w:hAnsi="HoloLens MDL2 Assets" w:cs="Times New Roman"/>
-          <w:kern w:val="0"/>
-          <w14:ligatures w14:val="none"/>
-        </w:rPr>
-        <w:t xml:space="preserve"> </w:t>
-      </w:r>
-      <w:r>
-        <w:rPr>
-          <w:rFonts w:ascii="Cambria" w:eastAsia="Times New Roman" w:hAnsi="Cambria" w:cs="Times New Roman"/>
-          <w:kern w:val="0"/>
-          <w14:ligatures w14:val="none"/>
-        </w:rPr>
-        <w:t>P</w:t>
-      </w:r>
-      <w:r>
-        <w:rPr>
-          <w:rFonts w:ascii="HoloLens MDL2 Assets" w:eastAsia="Times New Roman" w:hAnsi="HoloLens MDL2 Assets" w:cs="Times New Roman"/>
-          <w:kern w:val="0"/>
-          <w14:ligatures w14:val="none"/>
-        </w:rPr>
-        <w:t>roficient</w:t>
-      </w:r>
-      <w:r>
-        <w:rPr>
-          <w:rFonts w:ascii="HoloLens MDL2 Assets" w:eastAsia="Times New Roman" w:hAnsi="HoloLens MDL2 Assets" w:cs="Times New Roman"/>
-          <w:kern w:val="0"/>
-          <w14:ligatures w14:val="none"/>
-        </w:rPr>
-        <w:t xml:space="preserve"> </w:t>
-      </w:r>
-      <w:r>
-        <w:rPr>
-          <w:rFonts w:ascii="Cambria" w:eastAsia="Times New Roman" w:hAnsi="Cambria" w:cs="Times New Roman"/>
-          <w:kern w:val="0"/>
-          <w14:ligatures w14:val="none"/>
-        </w:rPr>
-        <w:t>in Linux and bash scripting</w:t>
-      </w:r>
-      <w:r>
-        <w:rPr>
-          <w:rFonts w:ascii="HoloLens MDL2 Assets" w:eastAsia="Times New Roman" w:hAnsi="HoloLens MDL2 Assets" w:cs="Times New Roman"/>
-          <w:kern w:val="0"/>
-          <w14:ligatures w14:val="none"/>
-        </w:rPr>
-        <w:t xml:space="preserve">, </w:t>
-      </w:r>
-      <w:r>
-        <w:rPr>
-          <w:rFonts w:ascii="HoloLens MDL2 Assets" w:eastAsia="Times New Roman" w:hAnsi="HoloLens MDL2 Assets" w:cs="Times New Roman"/>
-          <w:kern w:val="0"/>
-          <w14:ligatures w14:val="none"/>
-        </w:rPr>
-        <w:t>effective communication</w:t>
-      </w:r>
-      <w:r>
-        <w:rPr>
-          <w:rFonts w:ascii="HoloLens MDL2 Assets" w:eastAsia="Times New Roman" w:hAnsi="HoloLens MDL2 Assets" w:cs="Times New Roman"/>
-          <w:kern w:val="0"/>
-          <w14:ligatures w14:val="none"/>
-        </w:rPr>
-        <w:t xml:space="preserve">, </w:t>
-      </w:r>
-      <w:r>
-        <w:rPr>
-          <w:rFonts w:ascii="Cambria" w:eastAsia="Times New Roman" w:hAnsi="Cambria" w:cs="Times New Roman"/>
-          <w:kern w:val="0"/>
-          <w14:ligatures w14:val="none"/>
-        </w:rPr>
-        <w:t>diligent</w:t>
-      </w:r>
-      <w:r>
-        <w:rPr>
-          <w:rFonts w:ascii="HoloLens MDL2 Assets" w:eastAsia="Times New Roman" w:hAnsi="HoloLens MDL2 Assets" w:cs="Times New Roman"/>
-          <w:kern w:val="0"/>
-          <w14:ligatures w14:val="none"/>
-        </w:rPr>
-        <w:t xml:space="preserve">, </w:t>
-      </w:r>
-      <w:r>
-        <w:rPr>
-          <w:rFonts w:ascii="HoloLens MDL2 Assets" w:eastAsia="Times New Roman" w:hAnsi="HoloLens MDL2 Assets" w:cs="Times New Roman"/>
-          <w:kern w:val="0"/>
-          <w14:ligatures w14:val="none"/>
-        </w:rPr>
-        <w:t>problem-solver</w:t>
-      </w:r>
-    </w:p>
-    <w:p>
-      <w:pPr>
-        <w:spacing w:after="0" w:line="240" w:lineRule="auto"/>
-        <w:rPr>
-          <w:rFonts w:ascii="HoloLens MDL2 Assets" w:eastAsia="Times New Roman" w:hAnsi="HoloLens MDL2 Assets" w:cs="Times New Roman"/>
           <w:kern w:val="0"/>
           <w:sz w:val="20"/>
           <w:szCs w:val="20"/>
           <w14:ligatures w14:val="none"/>
         </w:rPr>
       </w:pPr>
+      <w:r>
+        <w:rPr>
+          <w:rFonts w:ascii="HoloLens MDL2 Assets" w:eastAsia="Times New Roman" w:hAnsi="HoloLens MDL2 Assets" w:cs="Times New Roman"/>
+          <w:b/>
+          <w:bCs/>
+          <w:i/>
+          <w:sz w:val="26"/>
+          <w:szCs w:val="24"/>
+        </w:rPr>
+        <w:t>Skills</w:t>
+      </w:r>
+    </w:p>
+    <w:p>
+      <w:pPr>
+        <w:spacing w:after="0" w:line="240" w:lineRule="auto"/>
+        <w:rPr>
+          <w:rFonts w:ascii="Cambria" w:eastAsia="Times New Roman" w:hAnsi="Cambria" w:cs="Times New Roman"/>
+          <w:kern w:val="0"/>
+          <w14:ligatures w14:val="none"/>
+        </w:rPr>
+      </w:pPr>
+      <w:r>
+        <w:rPr>
+          <w:rFonts w:ascii="HoloLens MDL2 Assets" w:eastAsia="Times New Roman" w:hAnsi="HoloLens MDL2 Assets" w:cs="Times New Roman"/>
+          <w:b/>
+          <w:kern w:val="0"/>
+          <w14:ligatures w14:val="none"/>
+        </w:rPr>
+        <w:t>Programming:</w:t>
+      </w:r>
+      <w:r>
+        <w:rPr>
+          <w:rFonts w:ascii="HoloLens MDL2 Assets" w:eastAsia="Times New Roman" w:hAnsi="HoloLens MDL2 Assets" w:cs="Times New Roman"/>
+          <w:kern w:val="0"/>
+          <w14:ligatures w14:val="none"/>
+        </w:rPr>
+        <w:t xml:space="preserve"> Python, Java, C, C#, C++,</w:t>
+      </w:r>
+      <w:r>
+        <w:rPr>
+          <w:rFonts w:ascii="HoloLens MDL2 Assets" w:eastAsia="Times New Roman" w:hAnsi="HoloLens MDL2 Assets" w:cs="Times New Roman"/>
+          <w:kern w:val="0"/>
+          <w14:ligatures w14:val="none"/>
+        </w:rPr>
+        <w:t xml:space="preserve"> JavaScript, TypeScript,</w:t>
+      </w:r>
+      <w:r>
+        <w:rPr>
+          <w:rFonts w:ascii="HoloLens MDL2 Assets" w:eastAsia="Times New Roman" w:hAnsi="HoloLens MDL2 Assets" w:cs="Times New Roman"/>
+          <w:kern w:val="0"/>
+          <w14:ligatures w14:val="none"/>
+        </w:rPr>
+        <w:t xml:space="preserve"> HTML</w:t>
+      </w:r>
+      <w:r>
+        <w:rPr>
+          <w:rFonts w:ascii="Cambria" w:eastAsia="Times New Roman" w:hAnsi="Cambria" w:cs="Times New Roman"/>
+          <w:kern w:val="0"/>
+          <w14:ligatures w14:val="none"/>
+        </w:rPr>
+        <w:t>/</w:t>
+      </w:r>
+      <w:r>
+        <w:rPr>
+          <w:rFonts w:ascii="HoloLens MDL2 Assets" w:eastAsia="Times New Roman" w:hAnsi="HoloLens MDL2 Assets" w:cs="Times New Roman"/>
+          <w:kern w:val="0"/>
+          <w14:ligatures w14:val="none"/>
+        </w:rPr>
+        <w:t>CSS</w:t>
+      </w:r>
+      <w:r>
+        <w:rPr>
+          <w:rFonts w:ascii="Cambria" w:eastAsia="Times New Roman" w:hAnsi="Cambria" w:cs="Times New Roman"/>
+          <w:kern w:val="0"/>
+          <w14:ligatures w14:val="none"/>
+        </w:rPr>
+        <w:t>, SQL, React, Flutter</w:t>
+      </w:r>
+    </w:p>
+    <w:p>
+      <w:pPr>
+        <w:spacing w:after="0" w:line="240" w:lineRule="auto"/>
+        <w:rPr>
+          <w:rFonts w:ascii="Cambria" w:eastAsia="Times New Roman" w:hAnsi="Cambria" w:cs="Times New Roman"/>
+          <w:kern w:val="0"/>
+          <w14:ligatures w14:val="none"/>
+        </w:rPr>
+      </w:pPr>
+      <w:r>
+        <w:rPr>
+          <w:rFonts w:ascii="Cambria" w:eastAsia="Times New Roman" w:hAnsi="Cambria" w:cs="Times New Roman"/>
+          <w:b/>
+          <w:bCs/>
+          <w:kern w:val="0"/>
+          <w14:ligatures w14:val="none"/>
+        </w:rPr>
+        <w:t>Tools</w:t>
+      </w:r>
+      <w:r>
+        <w:rPr>
+          <w:rFonts w:ascii="Cambria" w:eastAsia="Times New Roman" w:hAnsi="Cambria" w:cs="Times New Roman"/>
+          <w:b/>
+          <w:bCs/>
+          <w:kern w:val="0"/>
+          <w14:ligatures w14:val="none"/>
+        </w:rPr>
+        <w:t>:</w:t>
+      </w:r>
+      <w:r>
+        <w:rPr>
+          <w:rFonts w:ascii="Cambria" w:eastAsia="Times New Roman" w:hAnsi="Cambria" w:cs="Times New Roman"/>
+          <w:kern w:val="0"/>
+          <w14:ligatures w14:val="none"/>
+        </w:rPr>
+        <w:t xml:space="preserve"> PuTTY, Postman, </w:t>
+      </w:r>
+      <w:proofErr w:type="spellStart"/>
+      <w:r>
+        <w:rPr>
+          <w:rFonts w:ascii="Cambria" w:eastAsia="Times New Roman" w:hAnsi="Cambria" w:cs="Times New Roman"/>
+          <w:kern w:val="0"/>
+          <w14:ligatures w14:val="none"/>
+        </w:rPr>
+        <w:t>SwaggerHub</w:t>
+      </w:r>
+      <w:proofErr w:type="spellEnd"/>
+      <w:r>
+        <w:rPr>
+          <w:rFonts w:ascii="Cambria" w:eastAsia="Times New Roman" w:hAnsi="Cambria" w:cs="Times New Roman"/>
+          <w:kern w:val="0"/>
+          <w14:ligatures w14:val="none"/>
+        </w:rPr>
+        <w:t>, PowerShell/Command Line (CLI), Jira</w:t>
+      </w:r>
+    </w:p>
+    <w:p>
+      <w:pPr>
+        <w:spacing w:after="0" w:line="240" w:lineRule="auto"/>
+        <w:rPr>
+          <w:rFonts w:ascii="Cambria" w:eastAsia="Times New Roman" w:hAnsi="Cambria" w:cs="Times New Roman"/>
+          <w:kern w:val="0"/>
+          <w14:ligatures w14:val="none"/>
+        </w:rPr>
+      </w:pPr>
+      <w:r>
+        <w:rPr>
+          <w:rFonts w:ascii="Cambria" w:eastAsia="Times New Roman" w:hAnsi="Cambria" w:cs="Times New Roman"/>
+          <w:b/>
+          <w:bCs/>
+          <w:kern w:val="0"/>
+          <w14:ligatures w14:val="none"/>
+        </w:rPr>
+        <w:t>Troubleshooting:</w:t>
+      </w:r>
+      <w:r>
+        <w:rPr>
+          <w:rFonts w:ascii="Cambria" w:eastAsia="Times New Roman" w:hAnsi="Cambria" w:cs="Times New Roman"/>
+          <w:kern w:val="0"/>
+          <w14:ligatures w14:val="none"/>
+        </w:rPr>
+        <w:t xml:space="preserve"> Debugging software/hardware integrations, </w:t>
+      </w:r>
+      <w:r>
+        <w:rPr>
+          <w:rFonts w:ascii="Cambria" w:eastAsia="Times New Roman" w:hAnsi="Cambria" w:cs="Times New Roman"/>
+          <w:kern w:val="0"/>
+          <w14:ligatures w14:val="none"/>
+        </w:rPr>
+        <w:t>debugging system errors</w:t>
+      </w:r>
+    </w:p>
+    <w:p>
+      <w:pPr>
+        <w:spacing w:after="0" w:line="240" w:lineRule="auto"/>
+        <w:rPr>
+          <w:rFonts w:ascii="HoloLens MDL2 Assets" w:eastAsia="Times New Roman" w:hAnsi="HoloLens MDL2 Assets" w:cs="Times New Roman"/>
+          <w:kern w:val="0"/>
+          <w14:ligatures w14:val="none"/>
+        </w:rPr>
+      </w:pPr>
+      <w:r>
+        <w:rPr>
+          <w:rFonts w:ascii="HoloLens MDL2 Assets" w:eastAsia="Times New Roman" w:hAnsi="HoloLens MDL2 Assets" w:cs="Times New Roman"/>
+          <w:b/>
+          <w:kern w:val="0"/>
+          <w14:ligatures w14:val="none"/>
+        </w:rPr>
+        <w:t>Other:</w:t>
+      </w:r>
+      <w:r>
+        <w:rPr>
+          <w:rFonts w:ascii="HoloLens MDL2 Assets" w:eastAsia="Times New Roman" w:hAnsi="HoloLens MDL2 Assets" w:cs="Times New Roman"/>
+          <w:kern w:val="0"/>
+          <w14:ligatures w14:val="none"/>
+        </w:rPr>
+        <w:t xml:space="preserve"> </w:t>
+      </w:r>
+      <w:r>
+        <w:rPr>
+          <w:rFonts w:ascii="Cambria" w:eastAsia="Times New Roman" w:hAnsi="Cambria" w:cs="Times New Roman"/>
+          <w:kern w:val="0"/>
+          <w14:ligatures w14:val="none"/>
+        </w:rPr>
+        <w:t>P</w:t>
+      </w:r>
+      <w:r>
+        <w:rPr>
+          <w:rFonts w:ascii="HoloLens MDL2 Assets" w:eastAsia="Times New Roman" w:hAnsi="HoloLens MDL2 Assets" w:cs="Times New Roman"/>
+          <w:kern w:val="0"/>
+          <w14:ligatures w14:val="none"/>
+        </w:rPr>
+        <w:t>roficient</w:t>
+      </w:r>
+      <w:r>
+        <w:rPr>
+          <w:rFonts w:ascii="HoloLens MDL2 Assets" w:eastAsia="Times New Roman" w:hAnsi="HoloLens MDL2 Assets" w:cs="Times New Roman"/>
+          <w:kern w:val="0"/>
+          <w14:ligatures w14:val="none"/>
+        </w:rPr>
+        <w:t xml:space="preserve"> </w:t>
+      </w:r>
+      <w:r>
+        <w:rPr>
+          <w:rFonts w:ascii="Cambria" w:eastAsia="Times New Roman" w:hAnsi="Cambria" w:cs="Times New Roman"/>
+          <w:kern w:val="0"/>
+          <w14:ligatures w14:val="none"/>
+        </w:rPr>
+        <w:t>in Linux and bash scripting</w:t>
+      </w:r>
+      <w:r>
+        <w:rPr>
+          <w:rFonts w:ascii="HoloLens MDL2 Assets" w:eastAsia="Times New Roman" w:hAnsi="HoloLens MDL2 Assets" w:cs="Times New Roman"/>
+          <w:kern w:val="0"/>
+          <w14:ligatures w14:val="none"/>
+        </w:rPr>
+        <w:t xml:space="preserve">, effective communication, </w:t>
+      </w:r>
+      <w:r>
+        <w:rPr>
+          <w:rFonts w:ascii="Cambria" w:eastAsia="Times New Roman" w:hAnsi="Cambria" w:cs="Times New Roman"/>
+          <w:kern w:val="0"/>
+          <w14:ligatures w14:val="none"/>
+        </w:rPr>
+        <w:t>diligent</w:t>
+      </w:r>
+      <w:r>
+        <w:rPr>
+          <w:rFonts w:ascii="HoloLens MDL2 Assets" w:eastAsia="Times New Roman" w:hAnsi="HoloLens MDL2 Assets" w:cs="Times New Roman"/>
+          <w:kern w:val="0"/>
+          <w14:ligatures w14:val="none"/>
+        </w:rPr>
+        <w:t>, problem-solver</w:t>
+      </w:r>
+    </w:p>
+    <w:p>
+      <w:pPr>
+        <w:spacing w:after="0" w:line="240" w:lineRule="auto"/>
+        <w:rPr>
+          <w:rFonts w:ascii="HoloLens MDL2 Assets" w:eastAsia="Times New Roman" w:hAnsi="HoloLens MDL2 Assets" w:cs="Times New Roman"/>
+          <w:kern w:val="0"/>
+          <w:sz w:val="20"/>
+          <w:szCs w:val="20"/>
+          <w14:ligatures w14:val="none"/>
+        </w:rPr>
+      </w:pPr>
     </w:p>
     <w:p>
       <w:pPr>
@@ -1828,6 +1516,8 @@
           <w:b/>
           <w:i/>
           <w:kern w:val="0"/>
+          <w:sz w:val="20"/>
+          <w:szCs w:val="20"/>
           <w14:ligatures w14:val="none"/>
         </w:rPr>
       </w:pPr>
@@ -1837,8 +1527,8 @@
           <w:b/>
           <w:bCs/>
           <w:i/>
-          <w:sz w:val="28"/>
-          <w:szCs w:val="28"/>
+          <w:sz w:val="26"/>
+          <w:szCs w:val="24"/>
         </w:rPr>
         <w:t>Projects</w:t>
       </w:r>
@@ -1867,52 +1557,7 @@
           <w:kern w:val="0"/>
           <w14:ligatures w14:val="none"/>
         </w:rPr>
-        <w:t>Social</w:t>
-      </w:r>
-      <w:r>
-        <w:rPr>
-          <w:rFonts w:ascii="Cambria" w:eastAsia="Times New Roman" w:hAnsi="Cambria" w:cs="Times New Roman"/>
-          <w:b/>
-          <w:kern w:val="0"/>
-          <w14:ligatures w14:val="none"/>
-        </w:rPr>
-        <w:t xml:space="preserve"> </w:t>
-      </w:r>
-      <w:r>
-        <w:rPr>
-          <w:rFonts w:ascii="Cambria" w:eastAsia="Times New Roman" w:hAnsi="Cambria" w:cs="Times New Roman"/>
-          <w:b/>
-          <w:kern w:val="0"/>
-          <w14:ligatures w14:val="none"/>
-        </w:rPr>
-        <w:t>Sense</w:t>
-      </w:r>
-      <w:r>
-        <w:rPr>
-          <w:rFonts w:ascii="Cambria" w:eastAsia="Times New Roman" w:hAnsi="Cambria" w:cs="Times New Roman"/>
-          <w:b/>
-          <w:kern w:val="0"/>
-          <w14:ligatures w14:val="none"/>
-        </w:rPr>
-        <w:t xml:space="preserve"> </w:t>
-      </w:r>
-      <w:r>
-        <w:rPr>
-          <w:rFonts w:ascii="Cambria" w:eastAsia="Times New Roman" w:hAnsi="Cambria" w:cs="Times New Roman"/>
-          <w:b/>
-          <w:kern w:val="0"/>
-          <w14:ligatures w14:val="none"/>
-        </w:rPr>
-        <w:t>Mobile</w:t>
-      </w:r>
-      <w:r>
-        <w:rPr>
-          <w:rFonts w:ascii="Cambria" w:eastAsia="Times New Roman" w:hAnsi="Cambria" w:cs="Times New Roman"/>
-          <w:b/>
-          <w:kern w:val="0"/>
-          <w14:ligatures w14:val="none"/>
-        </w:rPr>
-        <w:t xml:space="preserve"> App</w:t>
+        <w:t>Social Sense Mobile App</w:t>
       </w:r>
     </w:p>
     <w:p>
@@ -1943,7 +1588,25 @@
           <w:kern w:val="0"/>
           <w14:ligatures w14:val="none"/>
         </w:rPr>
-        <w:t>Built a mobile app with Firestore to manage user data and Firebase for authentication</w:t>
+        <w:t xml:space="preserve">Built a mobile app with </w:t>
+      </w:r>
+      <w:proofErr w:type="spellStart"/>
+      <w:r>
+        <w:rPr>
+          <w:rFonts w:ascii="Cambria" w:eastAsia="Times New Roman" w:hAnsi="Cambria" w:cs="Times New Roman"/>
+          <w:kern w:val="0"/>
+          <w14:ligatures w14:val="none"/>
+        </w:rPr>
+        <w:t>Firestore</w:t>
+      </w:r>
+      <w:proofErr w:type="spellEnd"/>
+      <w:r>
+        <w:rPr>
+          <w:rFonts w:ascii="Cambria" w:eastAsia="Times New Roman" w:hAnsi="Cambria" w:cs="Times New Roman"/>
+          <w:kern w:val="0"/>
+          <w14:ligatures w14:val="none"/>
+        </w:rPr>
+        <w:t xml:space="preserve"> to manage user data and Firebase for authentication</w:t>
       </w:r>
     </w:p>
     <w:p>
@@ -2177,16 +1840,7 @@
           <w:kern w:val="0"/>
           <w14:ligatures w14:val="none"/>
         </w:rPr>
-        <w:t>Compiler</w:t>
-      </w:r>
-      <w:r>
-        <w:rPr>
-          <w:rFonts w:ascii="Cambria" w:eastAsia="Times New Roman" w:hAnsi="Cambria" w:cs="Times New Roman"/>
-          <w:b/>
-          <w:kern w:val="0"/>
-          <w14:ligatures w14:val="none"/>
-        </w:rPr>
-        <w:t xml:space="preserve"> Development</w:t>
+        <w:t>Compiler Development</w:t>
       </w:r>
     </w:p>
     <w:p>
@@ -2218,16 +1872,7 @@
           <w:kern w:val="0"/>
           <w14:ligatures w14:val="none"/>
         </w:rPr>
-        <w:t>Gained e</w:t>
-      </w:r>
-      <w:r>
-        <w:rPr>
-          <w:rFonts w:ascii="Cambria" w:eastAsia="Times New Roman" w:hAnsi="Cambria" w:cs="Times New Roman"/>
-          <w:color w:val="000000"/>
-          <w:kern w:val="0"/>
-          <w14:ligatures w14:val="none"/>
-        </w:rPr>
-        <w:t>xperience writing compilers in C and assembly languages</w:t>
+        <w:t>Gained experience writing compilers in C and assembly languages</w:t>
       </w:r>
     </w:p>
     <w:p>
@@ -2281,62 +1926,12 @@
     </w:p>
     <w:sectPr>
       <w:pgSz w:w="12240" w:h="15840"/>
-      <w:pgMar w:top="1080" w:right="1440" w:bottom="1080" w:left="1440" w:header="720" w:footer="720" w:gutter="0"/>
+      <w:pgMar w:top="1080" w:right="1440" w:bottom="720" w:left="1440" w:header="720" w:footer="720" w:gutter="0"/>
       <w:cols w:space="720"/>
       <w:docGrid w:linePitch="360"/>
     </w:sectPr>
   </w:body>
 </w:document>
-</file>
-
-<file path=word/endnotes.xml><?xml version="1.0" encoding="utf-8"?>
-<w:endnotes xmlns:wpc="http://schemas.microsoft.com/office/word/2010/wordprocessingCanvas" xmlns:cx="http://schemas.microsoft.com/office/drawing/2014/chartex" xmlns:cx1="http://schemas.microsoft.com/office/drawing/2015/9/8/chartex" xmlns:cx2="http://schemas.microsoft.com/office/drawing/2015/10/21/chartex" xmlns:cx3="http://schemas.microsoft.com/office/drawing/2016/5/9/chartex" xmlns:cx4="http://schemas.microsoft.com/office/drawing/2016/5/10/chartex" xmlns:cx5="http://schemas.microsoft.com/office/drawing/2016/5/11/chartex" xmlns:cx6="http://schemas.microsoft.com/office/drawing/2016/5/12/chartex" xmlns:cx7="http://schemas.microsoft.com/office/drawing/2016/5/13/chartex" xmlns:cx8="http://schemas.microsoft.com/office/drawing/2016/5/14/chartex" xmlns:mc="http://schemas.openxmlformats.org/markup-compatibility/2006" xmlns:aink="http://schemas.microsoft.com/office/drawing/2016/ink" xmlns:am3d="http://schemas.microsoft.com/office/drawing/2017/model3d" xmlns:o="urn:schemas-microsoft-com:office:office" xmlns:oel="http://schemas.microsoft.com/office/2019/extlst" xmlns:r="http://schemas.openxmlformats.org/officeDocument/2006/relationships" xmlns:m="http://schemas.openxmlformats.org/officeDocument/2006/math" xmlns:v="urn:schemas-microsoft-com:vml" xmlns:wp14="http://schemas.microsoft.com/office/word/2010/wordprocessingDrawing" xmlns:wp="http://schemas.openxmlformats.org/drawingml/2006/wordprocessingDrawing" xmlns:w10="urn:schemas-microsoft-com:office:word" xmlns:w="http://schemas.openxmlformats.org/wordprocessingml/2006/main" xmlns:w14="http://schemas.microsoft.com/office/word/2010/wordml" xmlns:w15="http://schemas.microsoft.com/office/word/2012/wordml" xmlns:w16cex="http://schemas.microsoft.com/office/word/2018/wordml/cex" xmlns:w16cid="http://schemas.microsoft.com/office/word/2016/wordml/cid" xmlns:w16="http://schemas.microsoft.com/office/word/2018/wordml" xmlns:w16du="http://schemas.microsoft.com/office/word/2023/wordml/word16du" xmlns:w16sdtdh="http://schemas.microsoft.com/office/word/2020/wordml/sdtdatahash" xmlns:w16sdtfl="http://schemas.microsoft.com/office/word/2024/wordml/sdtformatlock" xmlns:w16se="http://schemas.microsoft.com/office/word/2015/wordml/symex" xmlns:wpg="http://schemas.microsoft.com/office/word/2010/wordprocessingGroup" xmlns:wpi="http://schemas.microsoft.com/office/word/2010/wordprocessingInk" xmlns:wne="http://schemas.microsoft.com/office/word/2006/wordml" xmlns:wps="http://schemas.microsoft.com/office/word/2010/wordprocessingShape" mc:Ignorable="w14 w15 w16se w16cid w16 w16cex w16sdtdh w16sdtfl w16du wp14">
-  <w:endnote w:type="separator" w:id="-1">
-    <w:p>
-      <w:pPr>
-        <w:spacing w:after="0" w:line="240" w:lineRule="auto"/>
-      </w:pPr>
-      <w:r>
-        <w:separator/>
-      </w:r>
-    </w:p>
-  </w:endnote>
-  <w:endnote w:type="continuationSeparator" w:id="0">
-    <w:p>
-      <w:pPr>
-        <w:spacing w:after="0" w:line="240" w:lineRule="auto"/>
-      </w:pPr>
-      <w:r>
-        <w:continuationSeparator/>
-      </w:r>
-    </w:p>
-  </w:endnote>
-</w:endnotes>
-</file>
-
-<file path=word/footnotes.xml><?xml version="1.0" encoding="utf-8"?>
-<w:footnotes xmlns:wpc="http://schemas.microsoft.com/office/word/2010/wordprocessingCanvas" xmlns:cx="http://schemas.microsoft.com/office/drawing/2014/chartex" xmlns:cx1="http://schemas.microsoft.com/office/drawing/2015/9/8/chartex" xmlns:cx2="http://schemas.microsoft.com/office/drawing/2015/10/21/chartex" xmlns:cx3="http://schemas.microsoft.com/office/drawing/2016/5/9/chartex" xmlns:cx4="http://schemas.microsoft.com/office/drawing/2016/5/10/chartex" xmlns:cx5="http://schemas.microsoft.com/office/drawing/2016/5/11/chartex" xmlns:cx6="http://schemas.microsoft.com/office/drawing/2016/5/12/chartex" xmlns:cx7="http://schemas.microsoft.com/office/drawing/2016/5/13/chartex" xmlns:cx8="http://schemas.microsoft.com/office/drawing/2016/5/14/chartex" xmlns:mc="http://schemas.openxmlformats.org/markup-compatibility/2006" xmlns:aink="http://schemas.microsoft.com/office/drawing/2016/ink" xmlns:am3d="http://schemas.microsoft.com/office/drawing/2017/model3d" xmlns:o="urn:schemas-microsoft-com:office:office" xmlns:oel="http://schemas.microsoft.com/office/2019/extlst" xmlns:r="http://schemas.openxmlformats.org/officeDocument/2006/relationships" xmlns:m="http://schemas.openxmlformats.org/officeDocument/2006/math" xmlns:v="urn:schemas-microsoft-com:vml" xmlns:wp14="http://schemas.microsoft.com/office/word/2010/wordprocessingDrawing" xmlns:wp="http://schemas.openxmlformats.org/drawingml/2006/wordprocessingDrawing" xmlns:w10="urn:schemas-microsoft-com:office:word" xmlns:w="http://schemas.openxmlformats.org/wordprocessingml/2006/main" xmlns:w14="http://schemas.microsoft.com/office/word/2010/wordml" xmlns:w15="http://schemas.microsoft.com/office/word/2012/wordml" xmlns:w16cex="http://schemas.microsoft.com/office/word/2018/wordml/cex" xmlns:w16cid="http://schemas.microsoft.com/office/word/2016/wordml/cid" xmlns:w16="http://schemas.microsoft.com/office/word/2018/wordml" xmlns:w16du="http://schemas.microsoft.com/office/word/2023/wordml/word16du" xmlns:w16sdtdh="http://schemas.microsoft.com/office/word/2020/wordml/sdtdatahash" xmlns:w16sdtfl="http://schemas.microsoft.com/office/word/2024/wordml/sdtformatlock" xmlns:w16se="http://schemas.microsoft.com/office/word/2015/wordml/symex" xmlns:wpg="http://schemas.microsoft.com/office/word/2010/wordprocessingGroup" xmlns:wpi="http://schemas.microsoft.com/office/word/2010/wordprocessingInk" xmlns:wne="http://schemas.microsoft.com/office/word/2006/wordml" xmlns:wps="http://schemas.microsoft.com/office/word/2010/wordprocessingShape" mc:Ignorable="w14 w15 w16se w16cid w16 w16cex w16sdtdh w16sdtfl w16du wp14">
-  <w:footnote w:type="separator" w:id="-1">
-    <w:p>
-      <w:pPr>
-        <w:spacing w:after="0" w:line="240" w:lineRule="auto"/>
-      </w:pPr>
-      <w:r>
-        <w:separator/>
-      </w:r>
-    </w:p>
-  </w:footnote>
-  <w:footnote w:type="continuationSeparator" w:id="0">
-    <w:p>
-      <w:pPr>
-        <w:spacing w:after="0" w:line="240" w:lineRule="auto"/>
-      </w:pPr>
-      <w:r>
-        <w:continuationSeparator/>
-      </w:r>
-    </w:p>
-  </w:footnote>
-</w:footnotes>
 </file>
 
 <file path=word/numbering.xml><?xml version="1.0" encoding="utf-8"?>
@@ -2699,15 +2294,15 @@
       <w:rPr>
         <w:rFonts w:asciiTheme="minorHAnsi" w:eastAsiaTheme="minorHAnsi" w:hAnsiTheme="minorHAnsi" w:cstheme="minorBidi"/>
         <w:kern w:val="2"/>
-        <w:sz w:val="22"/>
-        <w:szCs w:val="22"/>
+        <w:sz w:val="24"/>
+        <w:szCs w:val="24"/>
         <w:lang w:val="en-US" w:eastAsia="en-US" w:bidi="ar-SA"/>
         <w14:ligatures w14:val="standardContextual"/>
       </w:rPr>
     </w:rPrDefault>
     <w:pPrDefault>
       <w:pPr>
-        <w:spacing w:after="160" w:line="259" w:lineRule="auto"/>
+        <w:spacing w:after="160" w:line="278" w:lineRule="auto"/>
       </w:pPr>
     </w:pPrDefault>
   </w:docDefaults>
@@ -3092,7 +2687,213 @@
   <w:style w:type="paragraph" w:default="1" w:styleId="Normal">
     <w:name w:val="Normal"/>
     <w:qFormat/>
-    <w:rsid w:val="006F09AE"/>
+    <w:rsid w:val="00623E76"/>
+    <w:pPr>
+      <w:spacing w:line="259" w:lineRule="auto"/>
+    </w:pPr>
+    <w:rPr>
+      <w:sz w:val="22"/>
+      <w:szCs w:val="22"/>
+    </w:rPr>
+  </w:style>
+  <w:style w:type="paragraph" w:styleId="Heading1">
+    <w:name w:val="heading 1"/>
+    <w:basedOn w:val="Normal"/>
+    <w:next w:val="Normal"/>
+    <w:link w:val="Heading1Char"/>
+    <w:uiPriority w:val="9"/>
+    <w:qFormat/>
+    <w:rsid w:val="00623E76"/>
+    <w:pPr>
+      <w:keepNext/>
+      <w:keepLines/>
+      <w:spacing w:before="360" w:after="80"/>
+      <w:outlineLvl w:val="0"/>
+    </w:pPr>
+    <w:rPr>
+      <w:rFonts w:asciiTheme="majorHAnsi" w:eastAsiaTheme="majorEastAsia" w:hAnsiTheme="majorHAnsi" w:cstheme="majorBidi"/>
+      <w:color w:val="0F4761" w:themeColor="accent1" w:themeShade="BF"/>
+      <w:sz w:val="40"/>
+      <w:szCs w:val="40"/>
+    </w:rPr>
+  </w:style>
+  <w:style w:type="paragraph" w:styleId="Heading2">
+    <w:name w:val="heading 2"/>
+    <w:basedOn w:val="Normal"/>
+    <w:next w:val="Normal"/>
+    <w:link w:val="Heading2Char"/>
+    <w:uiPriority w:val="9"/>
+    <w:semiHidden/>
+    <w:unhideWhenUsed/>
+    <w:qFormat/>
+    <w:rsid w:val="00623E76"/>
+    <w:pPr>
+      <w:keepNext/>
+      <w:keepLines/>
+      <w:spacing w:before="160" w:after="80"/>
+      <w:outlineLvl w:val="1"/>
+    </w:pPr>
+    <w:rPr>
+      <w:rFonts w:asciiTheme="majorHAnsi" w:eastAsiaTheme="majorEastAsia" w:hAnsiTheme="majorHAnsi" w:cstheme="majorBidi"/>
+      <w:color w:val="0F4761" w:themeColor="accent1" w:themeShade="BF"/>
+      <w:sz w:val="32"/>
+      <w:szCs w:val="32"/>
+    </w:rPr>
+  </w:style>
+  <w:style w:type="paragraph" w:styleId="Heading3">
+    <w:name w:val="heading 3"/>
+    <w:basedOn w:val="Normal"/>
+    <w:next w:val="Normal"/>
+    <w:link w:val="Heading3Char"/>
+    <w:uiPriority w:val="9"/>
+    <w:semiHidden/>
+    <w:unhideWhenUsed/>
+    <w:qFormat/>
+    <w:rsid w:val="00623E76"/>
+    <w:pPr>
+      <w:keepNext/>
+      <w:keepLines/>
+      <w:spacing w:before="160" w:after="80"/>
+      <w:outlineLvl w:val="2"/>
+    </w:pPr>
+    <w:rPr>
+      <w:rFonts w:eastAsiaTheme="majorEastAsia" w:cstheme="majorBidi"/>
+      <w:color w:val="0F4761" w:themeColor="accent1" w:themeShade="BF"/>
+      <w:sz w:val="28"/>
+      <w:szCs w:val="28"/>
+    </w:rPr>
+  </w:style>
+  <w:style w:type="paragraph" w:styleId="Heading4">
+    <w:name w:val="heading 4"/>
+    <w:basedOn w:val="Normal"/>
+    <w:next w:val="Normal"/>
+    <w:link w:val="Heading4Char"/>
+    <w:uiPriority w:val="9"/>
+    <w:semiHidden/>
+    <w:unhideWhenUsed/>
+    <w:qFormat/>
+    <w:rsid w:val="00623E76"/>
+    <w:pPr>
+      <w:keepNext/>
+      <w:keepLines/>
+      <w:spacing w:before="80" w:after="40"/>
+      <w:outlineLvl w:val="3"/>
+    </w:pPr>
+    <w:rPr>
+      <w:rFonts w:eastAsiaTheme="majorEastAsia" w:cstheme="majorBidi"/>
+      <w:i/>
+      <w:iCs/>
+      <w:color w:val="0F4761" w:themeColor="accent1" w:themeShade="BF"/>
+    </w:rPr>
+  </w:style>
+  <w:style w:type="paragraph" w:styleId="Heading5">
+    <w:name w:val="heading 5"/>
+    <w:basedOn w:val="Normal"/>
+    <w:next w:val="Normal"/>
+    <w:link w:val="Heading5Char"/>
+    <w:uiPriority w:val="9"/>
+    <w:semiHidden/>
+    <w:unhideWhenUsed/>
+    <w:qFormat/>
+    <w:rsid w:val="00623E76"/>
+    <w:pPr>
+      <w:keepNext/>
+      <w:keepLines/>
+      <w:spacing w:before="80" w:after="40"/>
+      <w:outlineLvl w:val="4"/>
+    </w:pPr>
+    <w:rPr>
+      <w:rFonts w:eastAsiaTheme="majorEastAsia" w:cstheme="majorBidi"/>
+      <w:color w:val="0F4761" w:themeColor="accent1" w:themeShade="BF"/>
+    </w:rPr>
+  </w:style>
+  <w:style w:type="paragraph" w:styleId="Heading6">
+    <w:name w:val="heading 6"/>
+    <w:basedOn w:val="Normal"/>
+    <w:next w:val="Normal"/>
+    <w:link w:val="Heading6Char"/>
+    <w:uiPriority w:val="9"/>
+    <w:semiHidden/>
+    <w:unhideWhenUsed/>
+    <w:qFormat/>
+    <w:rsid w:val="00623E76"/>
+    <w:pPr>
+      <w:keepNext/>
+      <w:keepLines/>
+      <w:spacing w:before="40" w:after="0"/>
+      <w:outlineLvl w:val="5"/>
+    </w:pPr>
+    <w:rPr>
+      <w:rFonts w:eastAsiaTheme="majorEastAsia" w:cstheme="majorBidi"/>
+      <w:i/>
+      <w:iCs/>
+      <w:color w:val="595959" w:themeColor="text1" w:themeTint="A6"/>
+    </w:rPr>
+  </w:style>
+  <w:style w:type="paragraph" w:styleId="Heading7">
+    <w:name w:val="heading 7"/>
+    <w:basedOn w:val="Normal"/>
+    <w:next w:val="Normal"/>
+    <w:link w:val="Heading7Char"/>
+    <w:uiPriority w:val="9"/>
+    <w:semiHidden/>
+    <w:unhideWhenUsed/>
+    <w:qFormat/>
+    <w:rsid w:val="00623E76"/>
+    <w:pPr>
+      <w:keepNext/>
+      <w:keepLines/>
+      <w:spacing w:before="40" w:after="0"/>
+      <w:outlineLvl w:val="6"/>
+    </w:pPr>
+    <w:rPr>
+      <w:rFonts w:eastAsiaTheme="majorEastAsia" w:cstheme="majorBidi"/>
+      <w:color w:val="595959" w:themeColor="text1" w:themeTint="A6"/>
+    </w:rPr>
+  </w:style>
+  <w:style w:type="paragraph" w:styleId="Heading8">
+    <w:name w:val="heading 8"/>
+    <w:basedOn w:val="Normal"/>
+    <w:next w:val="Normal"/>
+    <w:link w:val="Heading8Char"/>
+    <w:uiPriority w:val="9"/>
+    <w:semiHidden/>
+    <w:unhideWhenUsed/>
+    <w:qFormat/>
+    <w:rsid w:val="00623E76"/>
+    <w:pPr>
+      <w:keepNext/>
+      <w:keepLines/>
+      <w:spacing w:after="0"/>
+      <w:outlineLvl w:val="7"/>
+    </w:pPr>
+    <w:rPr>
+      <w:rFonts w:eastAsiaTheme="majorEastAsia" w:cstheme="majorBidi"/>
+      <w:i/>
+      <w:iCs/>
+      <w:color w:val="272727" w:themeColor="text1" w:themeTint="D8"/>
+    </w:rPr>
+  </w:style>
+  <w:style w:type="paragraph" w:styleId="Heading9">
+    <w:name w:val="heading 9"/>
+    <w:basedOn w:val="Normal"/>
+    <w:next w:val="Normal"/>
+    <w:link w:val="Heading9Char"/>
+    <w:uiPriority w:val="9"/>
+    <w:semiHidden/>
+    <w:unhideWhenUsed/>
+    <w:qFormat/>
+    <w:rsid w:val="00623E76"/>
+    <w:pPr>
+      <w:keepNext/>
+      <w:keepLines/>
+      <w:spacing w:after="0"/>
+      <w:outlineLvl w:val="8"/>
+    </w:pPr>
+    <w:rPr>
+      <w:rFonts w:eastAsiaTheme="majorEastAsia" w:cstheme="majorBidi"/>
+      <w:color w:val="272727" w:themeColor="text1" w:themeTint="D8"/>
+    </w:rPr>
   </w:style>
   <w:style w:type="character" w:default="1" w:styleId="DefaultParagraphFont">
     <w:name w:val="Default Paragraph Font"/>
@@ -3121,60 +2922,318 @@
     <w:semiHidden/>
     <w:unhideWhenUsed/>
   </w:style>
+  <w:style w:type="character" w:customStyle="1" w:styleId="Heading1Char">
+    <w:name w:val="Heading 1 Char"/>
+    <w:basedOn w:val="DefaultParagraphFont"/>
+    <w:link w:val="Heading1"/>
+    <w:uiPriority w:val="9"/>
+    <w:rsid w:val="00623E76"/>
+    <w:rPr>
+      <w:rFonts w:asciiTheme="majorHAnsi" w:eastAsiaTheme="majorEastAsia" w:hAnsiTheme="majorHAnsi" w:cstheme="majorBidi"/>
+      <w:color w:val="0F4761" w:themeColor="accent1" w:themeShade="BF"/>
+      <w:sz w:val="40"/>
+      <w:szCs w:val="40"/>
+    </w:rPr>
+  </w:style>
+  <w:style w:type="character" w:customStyle="1" w:styleId="Heading2Char">
+    <w:name w:val="Heading 2 Char"/>
+    <w:basedOn w:val="DefaultParagraphFont"/>
+    <w:link w:val="Heading2"/>
+    <w:uiPriority w:val="9"/>
+    <w:semiHidden/>
+    <w:rsid w:val="00623E76"/>
+    <w:rPr>
+      <w:rFonts w:asciiTheme="majorHAnsi" w:eastAsiaTheme="majorEastAsia" w:hAnsiTheme="majorHAnsi" w:cstheme="majorBidi"/>
+      <w:color w:val="0F4761" w:themeColor="accent1" w:themeShade="BF"/>
+      <w:sz w:val="32"/>
+      <w:szCs w:val="32"/>
+    </w:rPr>
+  </w:style>
+  <w:style w:type="character" w:customStyle="1" w:styleId="Heading3Char">
+    <w:name w:val="Heading 3 Char"/>
+    <w:basedOn w:val="DefaultParagraphFont"/>
+    <w:link w:val="Heading3"/>
+    <w:uiPriority w:val="9"/>
+    <w:semiHidden/>
+    <w:rsid w:val="00623E76"/>
+    <w:rPr>
+      <w:rFonts w:eastAsiaTheme="majorEastAsia" w:cstheme="majorBidi"/>
+      <w:color w:val="0F4761" w:themeColor="accent1" w:themeShade="BF"/>
+      <w:sz w:val="28"/>
+      <w:szCs w:val="28"/>
+    </w:rPr>
+  </w:style>
+  <w:style w:type="character" w:customStyle="1" w:styleId="Heading4Char">
+    <w:name w:val="Heading 4 Char"/>
+    <w:basedOn w:val="DefaultParagraphFont"/>
+    <w:link w:val="Heading4"/>
+    <w:uiPriority w:val="9"/>
+    <w:semiHidden/>
+    <w:rsid w:val="00623E76"/>
+    <w:rPr>
+      <w:rFonts w:eastAsiaTheme="majorEastAsia" w:cstheme="majorBidi"/>
+      <w:i/>
+      <w:iCs/>
+      <w:color w:val="0F4761" w:themeColor="accent1" w:themeShade="BF"/>
+    </w:rPr>
+  </w:style>
+  <w:style w:type="character" w:customStyle="1" w:styleId="Heading5Char">
+    <w:name w:val="Heading 5 Char"/>
+    <w:basedOn w:val="DefaultParagraphFont"/>
+    <w:link w:val="Heading5"/>
+    <w:uiPriority w:val="9"/>
+    <w:semiHidden/>
+    <w:rsid w:val="00623E76"/>
+    <w:rPr>
+      <w:rFonts w:eastAsiaTheme="majorEastAsia" w:cstheme="majorBidi"/>
+      <w:color w:val="0F4761" w:themeColor="accent1" w:themeShade="BF"/>
+    </w:rPr>
+  </w:style>
+  <w:style w:type="character" w:customStyle="1" w:styleId="Heading6Char">
+    <w:name w:val="Heading 6 Char"/>
+    <w:basedOn w:val="DefaultParagraphFont"/>
+    <w:link w:val="Heading6"/>
+    <w:uiPriority w:val="9"/>
+    <w:semiHidden/>
+    <w:rsid w:val="00623E76"/>
+    <w:rPr>
+      <w:rFonts w:eastAsiaTheme="majorEastAsia" w:cstheme="majorBidi"/>
+      <w:i/>
+      <w:iCs/>
+      <w:color w:val="595959" w:themeColor="text1" w:themeTint="A6"/>
+    </w:rPr>
+  </w:style>
+  <w:style w:type="character" w:customStyle="1" w:styleId="Heading7Char">
+    <w:name w:val="Heading 7 Char"/>
+    <w:basedOn w:val="DefaultParagraphFont"/>
+    <w:link w:val="Heading7"/>
+    <w:uiPriority w:val="9"/>
+    <w:semiHidden/>
+    <w:rsid w:val="00623E76"/>
+    <w:rPr>
+      <w:rFonts w:eastAsiaTheme="majorEastAsia" w:cstheme="majorBidi"/>
+      <w:color w:val="595959" w:themeColor="text1" w:themeTint="A6"/>
+    </w:rPr>
+  </w:style>
+  <w:style w:type="character" w:customStyle="1" w:styleId="Heading8Char">
+    <w:name w:val="Heading 8 Char"/>
+    <w:basedOn w:val="DefaultParagraphFont"/>
+    <w:link w:val="Heading8"/>
+    <w:uiPriority w:val="9"/>
+    <w:semiHidden/>
+    <w:rsid w:val="00623E76"/>
+    <w:rPr>
+      <w:rFonts w:eastAsiaTheme="majorEastAsia" w:cstheme="majorBidi"/>
+      <w:i/>
+      <w:iCs/>
+      <w:color w:val="272727" w:themeColor="text1" w:themeTint="D8"/>
+    </w:rPr>
+  </w:style>
+  <w:style w:type="character" w:customStyle="1" w:styleId="Heading9Char">
+    <w:name w:val="Heading 9 Char"/>
+    <w:basedOn w:val="DefaultParagraphFont"/>
+    <w:link w:val="Heading9"/>
+    <w:uiPriority w:val="9"/>
+    <w:semiHidden/>
+    <w:rsid w:val="00623E76"/>
+    <w:rPr>
+      <w:rFonts w:eastAsiaTheme="majorEastAsia" w:cstheme="majorBidi"/>
+      <w:color w:val="272727" w:themeColor="text1" w:themeTint="D8"/>
+    </w:rPr>
+  </w:style>
+  <w:style w:type="paragraph" w:styleId="Title">
+    <w:name w:val="Title"/>
+    <w:basedOn w:val="Normal"/>
+    <w:next w:val="Normal"/>
+    <w:link w:val="TitleChar"/>
+    <w:uiPriority w:val="10"/>
+    <w:qFormat/>
+    <w:rsid w:val="00623E76"/>
+    <w:pPr>
+      <w:spacing w:after="80" w:line="240" w:lineRule="auto"/>
+      <w:contextualSpacing/>
+    </w:pPr>
+    <w:rPr>
+      <w:rFonts w:asciiTheme="majorHAnsi" w:eastAsiaTheme="majorEastAsia" w:hAnsiTheme="majorHAnsi" w:cstheme="majorBidi"/>
+      <w:spacing w:val="-10"/>
+      <w:kern w:val="28"/>
+      <w:sz w:val="56"/>
+      <w:szCs w:val="56"/>
+    </w:rPr>
+  </w:style>
+  <w:style w:type="character" w:customStyle="1" w:styleId="TitleChar">
+    <w:name w:val="Title Char"/>
+    <w:basedOn w:val="DefaultParagraphFont"/>
+    <w:link w:val="Title"/>
+    <w:uiPriority w:val="10"/>
+    <w:rsid w:val="00623E76"/>
+    <w:rPr>
+      <w:rFonts w:asciiTheme="majorHAnsi" w:eastAsiaTheme="majorEastAsia" w:hAnsiTheme="majorHAnsi" w:cstheme="majorBidi"/>
+      <w:spacing w:val="-10"/>
+      <w:kern w:val="28"/>
+      <w:sz w:val="56"/>
+      <w:szCs w:val="56"/>
+    </w:rPr>
+  </w:style>
+  <w:style w:type="paragraph" w:styleId="Subtitle">
+    <w:name w:val="Subtitle"/>
+    <w:basedOn w:val="Normal"/>
+    <w:next w:val="Normal"/>
+    <w:link w:val="SubtitleChar"/>
+    <w:uiPriority w:val="11"/>
+    <w:qFormat/>
+    <w:rsid w:val="00623E76"/>
+    <w:pPr>
+      <w:numPr>
+        <w:ilvl w:val="1"/>
+      </w:numPr>
+    </w:pPr>
+    <w:rPr>
+      <w:rFonts w:eastAsiaTheme="majorEastAsia" w:cstheme="majorBidi"/>
+      <w:color w:val="595959" w:themeColor="text1" w:themeTint="A6"/>
+      <w:spacing w:val="15"/>
+      <w:sz w:val="28"/>
+      <w:szCs w:val="28"/>
+    </w:rPr>
+  </w:style>
+  <w:style w:type="character" w:customStyle="1" w:styleId="SubtitleChar">
+    <w:name w:val="Subtitle Char"/>
+    <w:basedOn w:val="DefaultParagraphFont"/>
+    <w:link w:val="Subtitle"/>
+    <w:uiPriority w:val="11"/>
+    <w:rsid w:val="00623E76"/>
+    <w:rPr>
+      <w:rFonts w:eastAsiaTheme="majorEastAsia" w:cstheme="majorBidi"/>
+      <w:color w:val="595959" w:themeColor="text1" w:themeTint="A6"/>
+      <w:spacing w:val="15"/>
+      <w:sz w:val="28"/>
+      <w:szCs w:val="28"/>
+    </w:rPr>
+  </w:style>
+  <w:style w:type="paragraph" w:styleId="Quote">
+    <w:name w:val="Quote"/>
+    <w:basedOn w:val="Normal"/>
+    <w:next w:val="Normal"/>
+    <w:link w:val="QuoteChar"/>
+    <w:uiPriority w:val="29"/>
+    <w:qFormat/>
+    <w:rsid w:val="00623E76"/>
+    <w:pPr>
+      <w:spacing w:before="160"/>
+      <w:jc w:val="center"/>
+    </w:pPr>
+    <w:rPr>
+      <w:i/>
+      <w:iCs/>
+      <w:color w:val="404040" w:themeColor="text1" w:themeTint="BF"/>
+    </w:rPr>
+  </w:style>
+  <w:style w:type="character" w:customStyle="1" w:styleId="QuoteChar">
+    <w:name w:val="Quote Char"/>
+    <w:basedOn w:val="DefaultParagraphFont"/>
+    <w:link w:val="Quote"/>
+    <w:uiPriority w:val="29"/>
+    <w:rsid w:val="00623E76"/>
+    <w:rPr>
+      <w:i/>
+      <w:iCs/>
+      <w:color w:val="404040" w:themeColor="text1" w:themeTint="BF"/>
+    </w:rPr>
+  </w:style>
   <w:style w:type="paragraph" w:styleId="ListParagraph">
     <w:name w:val="List Paragraph"/>
     <w:basedOn w:val="Normal"/>
     <w:uiPriority w:val="34"/>
     <w:qFormat/>
-    <w:rsid w:val="002E1DE0"/>
+    <w:rsid w:val="00623E76"/>
     <w:pPr>
       <w:ind w:left="720"/>
       <w:contextualSpacing/>
     </w:pPr>
   </w:style>
-  <w:style w:type="paragraph" w:styleId="Header">
-    <w:name w:val="header"/>
+  <w:style w:type="character" w:styleId="IntenseEmphasis">
+    <w:name w:val="Intense Emphasis"/>
+    <w:basedOn w:val="DefaultParagraphFont"/>
+    <w:uiPriority w:val="21"/>
+    <w:qFormat/>
+    <w:rsid w:val="00623E76"/>
+    <w:rPr>
+      <w:i/>
+      <w:iCs/>
+      <w:color w:val="0F4761" w:themeColor="accent1" w:themeShade="BF"/>
+    </w:rPr>
+  </w:style>
+  <w:style w:type="paragraph" w:styleId="IntenseQuote">
+    <w:name w:val="Intense Quote"/>
     <w:basedOn w:val="Normal"/>
-    <w:link w:val="HeaderChar"/>
+    <w:next w:val="Normal"/>
+    <w:link w:val="IntenseQuoteChar"/>
+    <w:uiPriority w:val="30"/>
+    <w:qFormat/>
+    <w:rsid w:val="00623E76"/>
+    <w:pPr>
+      <w:pBdr>
+        <w:top w:val="single" w:sz="4" w:space="10" w:color="0F4761" w:themeColor="accent1" w:themeShade="BF"/>
+        <w:bottom w:val="single" w:sz="4" w:space="10" w:color="0F4761" w:themeColor="accent1" w:themeShade="BF"/>
+      </w:pBdr>
+      <w:spacing w:before="360" w:after="360"/>
+      <w:ind w:left="864" w:right="864"/>
+      <w:jc w:val="center"/>
+    </w:pPr>
+    <w:rPr>
+      <w:i/>
+      <w:iCs/>
+      <w:color w:val="0F4761" w:themeColor="accent1" w:themeShade="BF"/>
+    </w:rPr>
+  </w:style>
+  <w:style w:type="character" w:customStyle="1" w:styleId="IntenseQuoteChar">
+    <w:name w:val="Intense Quote Char"/>
+    <w:basedOn w:val="DefaultParagraphFont"/>
+    <w:link w:val="IntenseQuote"/>
+    <w:uiPriority w:val="30"/>
+    <w:rsid w:val="00623E76"/>
+    <w:rPr>
+      <w:i/>
+      <w:iCs/>
+      <w:color w:val="0F4761" w:themeColor="accent1" w:themeShade="BF"/>
+    </w:rPr>
+  </w:style>
+  <w:style w:type="character" w:styleId="IntenseReference">
+    <w:name w:val="Intense Reference"/>
+    <w:basedOn w:val="DefaultParagraphFont"/>
+    <w:uiPriority w:val="32"/>
+    <w:qFormat/>
+    <w:rsid w:val="00623E76"/>
+    <w:rPr>
+      <w:b/>
+      <w:bCs/>
+      <w:smallCaps/>
+      <w:color w:val="0F4761" w:themeColor="accent1" w:themeShade="BF"/>
+      <w:spacing w:val="5"/>
+    </w:rPr>
+  </w:style>
+  <w:style w:type="character" w:styleId="Hyperlink">
+    <w:name w:val="Hyperlink"/>
+    <w:basedOn w:val="DefaultParagraphFont"/>
     <w:uiPriority w:val="99"/>
     <w:unhideWhenUsed/>
-    <w:rsid w:val="00720E2F"/>
-    <w:pPr>
-      <w:tabs>
-        <w:tab w:val="center" w:pos="4680"/>
-        <w:tab w:val="right" w:pos="9360"/>
-      </w:tabs>
-      <w:spacing w:after="0" w:line="240" w:lineRule="auto"/>
-    </w:pPr>
+    <w:rsid w:val="00623E76"/>
+    <w:rPr>
+      <w:color w:val="467886" w:themeColor="hyperlink"/>
+      <w:u w:val="single"/>
+    </w:rPr>
   </w:style>
-  <w:style w:type="character" w:customStyle="1" w:styleId="HeaderChar">
-    <w:name w:val="Header Char"/>
+  <w:style w:type="character" w:styleId="FollowedHyperlink">
+    <w:name w:val="FollowedHyperlink"/>
     <w:basedOn w:val="DefaultParagraphFont"/>
-    <w:link w:val="Header"/>
     <w:uiPriority w:val="99"/>
-    <w:rsid w:val="00720E2F"/>
-  </w:style>
-  <w:style w:type="paragraph" w:styleId="Footer">
-    <w:name w:val="footer"/>
-    <w:basedOn w:val="Normal"/>
-    <w:link w:val="FooterChar"/>
-    <w:uiPriority w:val="99"/>
+    <w:semiHidden/>
     <w:unhideWhenUsed/>
-    <w:rsid w:val="00720E2F"/>
-    <w:pPr>
-      <w:tabs>
-        <w:tab w:val="center" w:pos="4680"/>
-        <w:tab w:val="right" w:pos="9360"/>
-      </w:tabs>
-      <w:spacing w:after="0" w:line="240" w:lineRule="auto"/>
-    </w:pPr>
-  </w:style>
-  <w:style w:type="character" w:customStyle="1" w:styleId="FooterChar">
-    <w:name w:val="Footer Char"/>
-    <w:basedOn w:val="DefaultParagraphFont"/>
-    <w:link w:val="Footer"/>
-    <w:uiPriority w:val="99"/>
-    <w:rsid w:val="00720E2F"/>
+    <w:rsid w:val="00623E76"/>
+    <w:rPr>
+      <w:color w:val="96607D" w:themeColor="followedHyperlink"/>
+      <w:u w:val="single"/>
+    </w:rPr>
   </w:style>
 </w:styles>
 </file>
@@ -3190,39 +3249,39 @@
         <a:sysClr val="window" lastClr="FFFFFF"/>
       </a:lt1>
       <a:dk2>
-        <a:srgbClr val="44546A"/>
+        <a:srgbClr val="0E2841"/>
       </a:dk2>
       <a:lt2>
-        <a:srgbClr val="E7E6E6"/>
+        <a:srgbClr val="E8E8E8"/>
       </a:lt2>
       <a:accent1>
-        <a:srgbClr val="4472C4"/>
+        <a:srgbClr val="156082"/>
       </a:accent1>
       <a:accent2>
-        <a:srgbClr val="ED7D31"/>
+        <a:srgbClr val="E97132"/>
       </a:accent2>
       <a:accent3>
-        <a:srgbClr val="A5A5A5"/>
+        <a:srgbClr val="196B24"/>
       </a:accent3>
       <a:accent4>
-        <a:srgbClr val="FFC000"/>
+        <a:srgbClr val="0F9ED5"/>
       </a:accent4>
       <a:accent5>
-        <a:srgbClr val="5B9BD5"/>
+        <a:srgbClr val="A02B93"/>
       </a:accent5>
       <a:accent6>
-        <a:srgbClr val="70AD47"/>
+        <a:srgbClr val="4EA72E"/>
       </a:accent6>
       <a:hlink>
-        <a:srgbClr val="0563C1"/>
+        <a:srgbClr val="467886"/>
       </a:hlink>
       <a:folHlink>
-        <a:srgbClr val="954F72"/>
+        <a:srgbClr val="96607D"/>
       </a:folHlink>
     </a:clrScheme>
     <a:fontScheme name="Office">
       <a:majorFont>
-        <a:latin typeface="Calibri Light" panose="020F0302020204030204"/>
+        <a:latin typeface="Aptos Display" panose="02110004020202020204"/>
         <a:ea typeface=""/>
         <a:cs typeface=""/>
         <a:font script="Jpan" typeface="游ゴシック Light"/>
@@ -3274,10 +3333,10 @@
         <a:font script="Tfng" typeface="Ebrima"/>
       </a:majorFont>
       <a:minorFont>
-        <a:latin typeface="Calibri" panose="020F0502020204030204"/>
+        <a:latin typeface="Aptos" panose="02110004020202020204"/>
         <a:ea typeface=""/>
         <a:cs typeface=""/>
-        <a:font script="Jpan" typeface="游明朝"/>
+        <a:font script="Jpan" typeface="游ゴシック"/>
         <a:font script="Hang" typeface="맑은 고딕"/>
         <a:font script="Hans" typeface="等线"/>
         <a:font script="Hant" typeface="新細明體"/>
@@ -3472,16 +3531,4 @@
     </a:ext>
   </a:extLst>
 </a:theme>
-</file>
-
-<file path=customXml/item1.xml><?xml version="1.0" encoding="utf-8"?>
-<b:Sources xmlns:b="http://schemas.openxmlformats.org/officeDocument/2006/bibliography" xmlns="http://schemas.openxmlformats.org/officeDocument/2006/bibliography" SelectedStyle="\APASixthEditionOfficeOnline.xsl" StyleName="APA" Version="6"/>
-</file>
-
-<file path=customXml/itemProps1.xml><?xml version="1.0" encoding="utf-8"?>
-<ds:datastoreItem xmlns:ds="http://schemas.openxmlformats.org/officeDocument/2006/customXml" ds:itemID="{66B769D5-6261-4A00-A37F-6B5D86438148}">
-  <ds:schemaRefs>
-    <ds:schemaRef ds:uri="http://schemas.openxmlformats.org/officeDocument/2006/bibliography"/>
-  </ds:schemaRefs>
-</ds:datastoreItem>
 </file>
</xml_diff>